<commit_message>
Deel 1: citaten staan al in de tabel; stap 6 en stap 4 hulp herschreven
Co-Authored-By: Claude Sonnet 5.5 <noreply@anthropic.com>
</commit_message>
<xml_diff>
--- a/werkdocument/Interviewmail.docx
+++ b/werkdocument/Interviewmail.docx
@@ -552,7 +552,7 @@
           <w:color w:val="5F6368"/>
           <w:sz w:val="19"/>
         </w:rPr>
-        <w:t>Vergelijk ze per onderdeel. Rij 1 deed je leraar voor. Schrijf bij rij 2 tot 6 in een paar woorden wat Senne deed en wat Noor deed. Leg dan uit waarom het bij Noor beter werkt.</w:t>
+        <w:t>Vergelijk ze per onderdeel. Rij 1 deed je leraar voor. Schrijf bij rij 2 tot 6 in de laatste kolom waarom het bij Noor beter werkt.</w:t>
       </w:r>
     </w:p>
     <w:tbl>
@@ -676,9 +676,6 @@
           </w:tcPr>
           <w:p>
             <w:r>
-              <w:rPr>
-                <w:sz w:val="19"/>
-              </w:rPr>
               <w:t>Bij vraagje weet de ontvanger niet waarover het gaat. Bij Noor zie je waarover (een interview over groepschats) en van wie (Onderzoekslabo) nog voor je de e-mail opent.</w:t>
             </w:r>
           </w:p>
@@ -706,7 +703,12 @@
             <w:tcW w:type="dxa" w:w="1928"/>
           </w:tcPr>
           <w:p>
-            <w:r/>
+            <w:r>
+              <w:rPr>
+                <w:sz w:val="19"/>
+              </w:rPr>
+              <w:t>hallo,</w:t>
+            </w:r>
           </w:p>
         </w:tc>
         <w:tc>
@@ -714,7 +716,12 @@
             <w:tcW w:type="dxa" w:w="2494"/>
           </w:tcPr>
           <w:p>
-            <w:r/>
+            <w:r>
+              <w:rPr>
+                <w:sz w:val="19"/>
+              </w:rPr>
+              <w:t>Beste meneer Willems,</w:t>
+            </w:r>
           </w:p>
         </w:tc>
         <w:tc>
@@ -748,7 +755,12 @@
             <w:tcW w:type="dxa" w:w="1928"/>
           </w:tcPr>
           <w:p>
-            <w:r/>
+            <w:r>
+              <w:rPr>
+                <w:sz w:val="19"/>
+              </w:rPr>
+              <w:t>ik zit in het 3de jaar en we moeten een interview doen voor een taak over slaap</w:t>
+            </w:r>
           </w:p>
         </w:tc>
         <w:tc>
@@ -756,7 +768,12 @@
             <w:tcW w:type="dxa" w:w="2494"/>
           </w:tcPr>
           <w:p>
-            <w:r/>
+            <w:r>
+              <w:rPr>
+                <w:sz w:val="19"/>
+              </w:rPr>
+              <w:t>Mijn naam is Noor Van Hecke en ik zit in 3MWWE … namens het Onderzoekslabo Jongeren &amp; Welzijn …</w:t>
+            </w:r>
           </w:p>
         </w:tc>
         <w:tc>
@@ -790,7 +807,12 @@
             <w:tcW w:type="dxa" w:w="1928"/>
           </w:tcPr>
           <w:p>
-            <w:r/>
+            <w:r>
+              <w:rPr>
+                <w:sz w:val="19"/>
+              </w:rPr>
+              <w:t>kunt ge morgen na school?</w:t>
+            </w:r>
           </w:p>
         </w:tc>
         <w:tc>
@@ -798,7 +820,12 @@
             <w:tcW w:type="dxa" w:w="2494"/>
           </w:tcPr>
           <w:p>
-            <w:r/>
+            <w:r>
+              <w:rPr>
+                <w:sz w:val="19"/>
+              </w:rPr>
+              <w:t>ongeveer 20 minuten … woensdag 28 oktober om 15 uur of donderdag 29 oktober om 13 uur, bij het CLB of online … Uw naam komt niet in ons verslag</w:t>
+            </w:r>
           </w:p>
         </w:tc>
         <w:tc>
@@ -832,7 +859,12 @@
             <w:tcW w:type="dxa" w:w="1928"/>
           </w:tcPr>
           <w:p>
-            <w:r/>
+            <w:r>
+              <w:rPr>
+                <w:sz w:val="19"/>
+              </w:rPr>
+              <w:t>(geen slot)</w:t>
+            </w:r>
           </w:p>
         </w:tc>
         <w:tc>
@@ -840,7 +872,12 @@
             <w:tcW w:type="dxa" w:w="2494"/>
           </w:tcPr>
           <w:p>
-            <w:r/>
+            <w:r>
+              <w:rPr>
+                <w:sz w:val="19"/>
+              </w:rPr>
+              <w:t>vóór dinsdag 20 oktober … Alvast bedankt voor uw tijd.</w:t>
+            </w:r>
           </w:p>
         </w:tc>
         <w:tc>
@@ -874,7 +911,12 @@
             <w:tcW w:type="dxa" w:w="1928"/>
           </w:tcPr>
           <w:p>
-            <w:r/>
+            <w:r>
+              <w:rPr>
+                <w:sz w:val="19"/>
+              </w:rPr>
+              <w:t>thx!! 🙂  Senne</w:t>
+            </w:r>
           </w:p>
         </w:tc>
         <w:tc>
@@ -882,7 +924,12 @@
             <w:tcW w:type="dxa" w:w="2494"/>
           </w:tcPr>
           <w:p>
-            <w:r/>
+            <w:r>
+              <w:rPr>
+                <w:sz w:val="19"/>
+              </w:rPr>
+              <w:t>Met vriendelijke groeten, Noor Van Hecke, 3MWWE, Onderzoekslabo Jongeren &amp; Welzijn, GO! Dalton Gent</w:t>
+            </w:r>
           </w:p>
         </w:tc>
         <w:tc>

</xml_diff>

<commit_message>
Werkdocument Interviewmail in de nieuwe huisstijl, zoals Stagemail
Geen kopregel of Zo werk je; de volledige e-mails van Senne en Noor alleen nog op de lespagina (de tabel
van deel 1 citeert ze al); vakken in plaats van lijntjes; deel 4 = de criteria van § 22 met de punten;
geen knop Verzenden (Jonas, 12-10-2026). Lespagina: geen naam/klas/datum meer, checklist 20 taken.

Co-Authored-By: Claude Opus 5.5 <noreply@anthropic.com>
</commit_message>
<xml_diff>
--- a/werkdocument/Interviewmail.docx
+++ b/werkdocument/Interviewmail.docx
@@ -2,234 +2,123 @@
 <file path=word/document.xml><?xml version="1.0" encoding="utf-8"?>
 <w:document xmlns:wpc="http://schemas.microsoft.com/office/word/2010/wordprocessingCanvas" xmlns:mo="http://schemas.microsoft.com/office/mac/office/2008/main" xmlns:mc="http://schemas.openxmlformats.org/markup-compatibility/2006" xmlns:mv="urn:schemas-microsoft-com:mac:vml" xmlns:o="urn:schemas-microsoft-com:office:office" xmlns:r="http://schemas.openxmlformats.org/officeDocument/2006/relationships" xmlns:m="http://schemas.openxmlformats.org/officeDocument/2006/math" xmlns:v="urn:schemas-microsoft-com:vml" xmlns:wp14="http://schemas.microsoft.com/office/word/2010/wordprocessingDrawing" xmlns:wp="http://schemas.openxmlformats.org/drawingml/2006/wordprocessingDrawing" xmlns:w10="urn:schemas-microsoft-com:office:word" xmlns:w="http://schemas.openxmlformats.org/wordprocessingml/2006/main" xmlns:w14="http://schemas.microsoft.com/office/word/2010/wordml" xmlns:wpg="http://schemas.microsoft.com/office/word/2010/wordprocessingGroup" xmlns:wpi="http://schemas.microsoft.com/office/word/2010/wordprocessingInk" xmlns:wne="http://schemas.microsoft.com/office/word/2006/wordml" xmlns:wps="http://schemas.microsoft.com/office/word/2010/wordprocessingShape" mc:Ignorable="w14 wp14">
   <w:body>
-    <w:p>
-      <w:r>
-        <w:rPr>
-          <w:b/>
-          <w:color w:val="2A3973"/>
-          <w:sz w:val="44"/>
-        </w:rPr>
-        <w:t>INTERVIEWMAIL</w:t>
-      </w:r>
-    </w:p>
-    <w:p>
-      <w:pPr>
-        <w:spacing w:after="200"/>
-      </w:pPr>
-      <w:r>
-        <w:rPr>
-          <w:b w:val="0"/>
-          <w:i w:val="0"/>
-          <w:color w:val="5F6368"/>
-          <w:sz w:val="19"/>
-        </w:rPr>
-        <w:t>Les 3 — De formele e-mail  ·  Toegepaste Informatica  ·  Onderzoekslabo Jongeren &amp; Welzijn</w:t>
-      </w:r>
-    </w:p>
     <w:tbl>
       <w:tblPr>
-        <w:tblStyle w:val="TableGrid"/>
         <w:tblW w:type="auto" w:w="0"/>
+        <w:jc w:val="center"/>
         <w:tblLayout w:type="fixed"/>
         <w:tblLook w:firstColumn="1" w:firstRow="1" w:lastColumn="0" w:lastRow="0" w:noHBand="0" w:noVBand="1" w:val="04A0"/>
+        <w:tblBorders>
+          <w:top w:val="nil"/>
+          <w:left w:val="nil"/>
+          <w:bottom w:val="nil"/>
+          <w:right w:val="nil"/>
+          <w:insideH w:val="nil"/>
+          <w:insideV w:val="nil"/>
+        </w:tblBorders>
+        <w:tblLayout w:type="fixed"/>
       </w:tblPr>
       <w:tblGrid>
-        <w:gridCol w:w="3969"/>
-        <w:gridCol w:w="2268"/>
-        <w:gridCol w:w="3402"/>
+        <w:gridCol w:w="2041"/>
+        <w:gridCol w:w="6009"/>
+        <w:gridCol w:w="1587"/>
       </w:tblGrid>
       <w:tr>
+        <w:trPr>
+          <w:trHeight w:val="1134" w:hRule="atLeast"/>
+        </w:trPr>
         <w:tc>
           <w:tcPr>
-            <w:tcW w:type="dxa" w:w="3969"/>
+            <w:tcW w:type="dxa" w:w="2041"/>
+            <w:vAlign w:val="center"/>
           </w:tcPr>
           <w:p>
+            <w:pPr>
+              <w:spacing w:before="0" w:after="0"/>
+            </w:pPr>
             <w:r>
-              <w:rPr>
-                <w:b/>
-              </w:rPr>
-              <w:t xml:space="preserve">Naam: </w:t>
+              <w:drawing>
+                <wp:inline xmlns:a="http://schemas.openxmlformats.org/drawingml/2006/main" xmlns:pic="http://schemas.openxmlformats.org/drawingml/2006/picture">
+                  <wp:extent cx="1152000" cy="713354"/>
+                  <wp:docPr id="1" name="Picture 1"/>
+                  <wp:cNvGraphicFramePr>
+                    <a:graphicFrameLocks noChangeAspect="1"/>
+                  </wp:cNvGraphicFramePr>
+                  <a:graphic>
+                    <a:graphicData uri="http://schemas.openxmlformats.org/drawingml/2006/picture">
+                      <pic:pic>
+                        <pic:nvPicPr>
+                          <pic:cNvPr id="0" name="go-dalton-gent.png"/>
+                          <pic:cNvPicPr/>
+                        </pic:nvPicPr>
+                        <pic:blipFill>
+                          <a:blip r:embed="rId9"/>
+                          <a:stretch>
+                            <a:fillRect/>
+                          </a:stretch>
+                        </pic:blipFill>
+                        <pic:spPr>
+                          <a:xfrm>
+                            <a:off x="0" y="0"/>
+                            <a:ext cx="1152000" cy="713354"/>
+                          </a:xfrm>
+                          <a:prstGeom prst="rect"/>
+                        </pic:spPr>
+                      </pic:pic>
+                    </a:graphicData>
+                  </a:graphic>
+                </wp:inline>
+              </w:drawing>
             </w:r>
           </w:p>
         </w:tc>
         <w:tc>
           <w:tcPr>
-            <w:tcW w:type="dxa" w:w="2268"/>
+            <w:tcW w:type="dxa" w:w="6009"/>
+            <w:vAlign w:val="center"/>
           </w:tcPr>
           <w:p>
+            <w:pPr>
+              <w:spacing w:before="0" w:after="0"/>
+              <w:jc w:val="center"/>
+            </w:pPr>
             <w:r>
               <w:rPr>
+                <w:rFonts w:ascii="Montserrat" w:hAnsi="Montserrat" w:eastAsia="Montserrat"/>
                 <w:b/>
+                <w:i w:val="0"/>
+                <w:color w:val="2A3973"/>
+                <w:sz w:val="44"/>
               </w:rPr>
-              <w:t xml:space="preserve">Klas: </w:t>
+              <w:t>INTERVIEWMAIL</w:t>
             </w:r>
           </w:p>
         </w:tc>
         <w:tc>
           <w:tcPr>
-            <w:tcW w:type="dxa" w:w="3402"/>
-          </w:tcPr>
-          <w:p>
-            <w:r>
-              <w:rPr>
-                <w:b/>
-              </w:rPr>
-              <w:t xml:space="preserve">Datum: </w:t>
-            </w:r>
-          </w:p>
-        </w:tc>
-      </w:tr>
-    </w:tbl>
-    <w:p/>
-    <w:p>
-      <w:pPr>
-        <w:keepNext/>
-        <w:spacing w:before="120" w:after="80"/>
-      </w:pPr>
-      <w:r>
-        <w:rPr>
-          <w:b/>
-          <w:color w:val="2A3973"/>
-          <w:sz w:val="26"/>
-        </w:rPr>
-        <w:t>Zo werk je</w:t>
-      </w:r>
-    </w:p>
-    <w:p>
-      <w:pPr>
-        <w:spacing w:after="40"/>
-      </w:pPr>
-      <w:r>
-        <w:t>1.  Op de lespagina lees je wat je moet doen, stap voor stap.</w:t>
-      </w:r>
-    </w:p>
-    <w:p>
-      <w:pPr>
-        <w:spacing w:after="40"/>
-      </w:pPr>
-      <w:r>
-        <w:t>2.  Je schrijft alles in DIT document. Je hebt niets anders nodig.</w:t>
-      </w:r>
-    </w:p>
-    <w:p>
-      <w:pPr>
-        <w:spacing w:after="40"/>
-      </w:pPr>
-      <w:r>
-        <w:t>3.  Je e-mail schrijf je in deel 3, in een venster dat eruitziet als Nieuw bericht in Gmail.</w:t>
-      </w:r>
-    </w:p>
-    <w:p>
-      <w:pPr>
-        <w:spacing w:after="40"/>
-      </w:pPr>
-      <w:r>
-        <w:t>4.  Klaar? Klik in de opdracht op Inleveren. Er wordt niets echt verstuurd.</w:t>
-      </w:r>
-    </w:p>
-    <w:p>
-      <w:pPr>
-        <w:keepNext/>
-        <w:spacing w:before="280" w:after="80"/>
-      </w:pPr>
-      <w:r>
-        <w:rPr>
-          <w:b/>
-          <w:color w:val="2A3973"/>
-          <w:sz w:val="26"/>
-        </w:rPr>
-        <w:t>Je onderzoek</w:t>
-      </w:r>
-    </w:p>
-    <w:tbl>
-      <w:tblPr>
-        <w:tblW w:type="auto" w:w="0"/>
-        <w:tblLayout w:type="fixed"/>
-        <w:tblLook w:firstColumn="1" w:firstRow="1" w:lastColumn="0" w:lastRow="0" w:noHBand="0" w:noVBand="1" w:val="04A0"/>
-        <w:tblBorders>
-          <w:top w:val="single" w:sz="8" w:color="A7B1DE"/>
-          <w:left w:val="single" w:sz="8" w:color="A7B1DE"/>
-          <w:bottom w:val="single" w:sz="8" w:color="A7B1DE"/>
-          <w:right w:val="single" w:sz="8" w:color="A7B1DE"/>
-          <w:insideH w:val="nil"/>
-          <w:insideV w:val="nil"/>
-        </w:tblBorders>
-      </w:tblPr>
-      <w:tblGrid>
-        <w:gridCol w:w="9638"/>
-      </w:tblGrid>
-      <w:tr>
-        <w:tc>
-          <w:tcPr>
-            <w:tcW w:type="dxa" w:w="9638"/>
-            <w:shd w:val="clear" w:fill="EEF0F9"/>
+            <w:tcW w:type="dxa" w:w="1587"/>
+            <w:vAlign w:val="center"/>
+            <w:tcBorders>
+              <w:top w:val="single" w:sz="12" w:space="0" w:color="3C51A0"/>
+              <w:left w:val="single" w:sz="12" w:space="0" w:color="3C51A0"/>
+              <w:bottom w:val="single" w:sz="12" w:space="0" w:color="3C51A0"/>
+              <w:right w:val="single" w:sz="12" w:space="0" w:color="3C51A0"/>
+            </w:tcBorders>
           </w:tcPr>
           <w:p>
             <w:pPr>
-              <w:spacing w:after="80"/>
-            </w:pPr>
-            <w:r/>
-            <w:r>
-              <w:t>Je onderzoeksgroep in het Onderzoekslabo Jongeren &amp; Welzijn onderzoekt schermgebruik en slaap bij jongeren (het onderzoeksplan uit les 2). Jullie willen een interview met een jongerenwerker.</w:t>
-            </w:r>
-          </w:p>
-          <w:p>
-            <w:pPr>
-              <w:spacing w:after="80"/>
+              <w:spacing w:before="0" w:after="0"/>
+              <w:jc w:val="right"/>
             </w:pPr>
             <w:r>
               <w:rPr>
+                <w:rFonts w:ascii="Montserrat" w:hAnsi="Montserrat" w:eastAsia="Montserrat"/>
                 <w:b/>
+                <w:i w:val="0"/>
+                <w:color w:val="3C51A0"/>
+                <w:sz w:val="36"/>
               </w:rPr>
-              <w:t>Het interview:  mevrouw Hanne De Clercq, jongerenwerker bij Jongerenhuis De Lantaarn  —  hanne.declercq@delantaarn.example</w:t>
-            </w:r>
-          </w:p>
-          <w:p>
-            <w:pPr>
-              <w:spacing w:after="80"/>
-            </w:pPr>
-            <w:r>
-              <w:rPr>
-                <w:b/>
-              </w:rPr>
-              <w:t>Je onderzoeksbegeleider:  mevrouw Ines Coppens  —  ines.coppens@onderzoekslabo.example</w:t>
-            </w:r>
-          </w:p>
-          <w:p>
-            <w:pPr>
-              <w:spacing w:after="80"/>
-            </w:pPr>
-            <w:r>
-              <w:t>Wat je vraagt:  een interview van ongeveer 20 minuten  ·  twee mogelijke momenten: woensdag 21 oktober om 14 uur of donderdag 22 oktober om 16 uur  ·  in het jongerenhuis of online.</w:t>
-            </w:r>
-          </w:p>
-          <w:p>
-            <w:pPr>
-              <w:spacing w:after="80"/>
-            </w:pPr>
-            <w:r>
-              <w:t>Wat er met haar antwoorden gebeurt:  ze worden gebruikt voor een schoolonderzoek en haar naam komt niet in het verslag.</w:t>
-            </w:r>
-          </w:p>
-          <w:p>
-            <w:pPr>
-              <w:spacing w:after="80"/>
-            </w:pPr>
-            <w:r>
-              <w:t>Tegen wanneer je een antwoord hoopt:  maandag 19 oktober.</w:t>
-            </w:r>
-          </w:p>
-          <w:p>
-            <w:pPr>
-              <w:spacing w:after="80"/>
-            </w:pPr>
-            <w:r>
-              <w:rPr>
-                <w:i/>
-                <w:color w:val="5F6368"/>
-                <w:sz w:val="18"/>
-              </w:rPr>
-              <w:t>Je schrijft zelf de zinnen. Alle namen en adressen zijn verzonnen.</w:t>
+              <w:t>/ 20</w:t>
             </w:r>
           </w:p>
         </w:tc>
@@ -237,922 +126,168 @@
     </w:tbl>
     <w:p>
       <w:pPr>
-        <w:keepNext/>
-        <w:spacing w:before="280" w:after="80"/>
+        <w:spacing w:before="0" w:after="0" w:line="200" w:lineRule="exact"/>
+        <w:rPr>
+          <w:sz w:val="10"/>
+        </w:rPr>
       </w:pPr>
-      <w:r>
-        <w:rPr>
-          <w:b/>
-          <w:color w:val="2A3973"/>
-          <w:sz w:val="32"/>
-        </w:rPr>
-        <w:t>Deel 1 — Goed of zwak?</w:t>
-      </w:r>
-    </w:p>
-    <w:p>
-      <w:pPr>
-        <w:spacing w:after="120"/>
-      </w:pPr>
-      <w:r>
-        <w:rPr>
-          <w:b w:val="0"/>
-          <w:i w:val="0"/>
-          <w:color w:val="5F6368"/>
-          <w:sz w:val="19"/>
-        </w:rPr>
-        <w:t>Senne en Noor vroegen allebei een interview aan. Lees hun e-mails. Noor schreef over een ander onderzoek en aan iemand anders: kijk naar hoe ze het opbouwt, niet naar haar zinnen.</w:t>
-      </w:r>
     </w:p>
     <w:tbl>
       <w:tblPr>
-        <w:tblStyle w:val="TableGrid"/>
         <w:tblW w:type="auto" w:w="0"/>
         <w:jc w:val="center"/>
         <w:tblLayout w:type="fixed"/>
         <w:tblLook w:firstColumn="1" w:firstRow="1" w:lastColumn="0" w:lastRow="0" w:noHBand="0" w:noVBand="1" w:val="04A0"/>
+        <w:tblBorders>
+          <w:top w:val="single" w:sz="6" w:space="0" w:color="A7B1DE"/>
+          <w:left w:val="single" w:sz="6" w:space="0" w:color="A7B1DE"/>
+          <w:bottom w:val="single" w:sz="6" w:space="0" w:color="A7B1DE"/>
+          <w:right w:val="single" w:sz="6" w:space="0" w:color="A7B1DE"/>
+          <w:insideH w:val="nil"/>
+          <w:insideV w:val="nil"/>
+        </w:tblBorders>
+        <w:tblLayout w:type="fixed"/>
       </w:tblPr>
       <w:tblGrid>
-        <w:gridCol w:w="3515"/>
-        <w:gridCol w:w="6123"/>
+        <w:gridCol w:w="9638"/>
       </w:tblGrid>
       <w:tr>
+        <w:trPr>
+          <w:cantSplit/>
+        </w:trPr>
         <w:tc>
           <w:tcPr>
-            <w:tcW w:type="dxa" w:w="3515"/>
+            <w:tcW w:type="dxa" w:w="9638"/>
+            <w:shd w:val="clear" w:color="auto" w:fill="EEF0F9"/>
+            <w:tcMar>
+              <w:top w:w="113" w:type="dxa"/>
+              <w:left w:w="170" w:type="dxa"/>
+              <w:bottom w:w="113" w:type="dxa"/>
+              <w:right w:w="170" w:type="dxa"/>
+            </w:tcMar>
           </w:tcPr>
+          <w:p>
+            <w:pPr>
+              <w:spacing w:after="80"/>
+            </w:pPr>
+            <w:r>
+              <w:rPr>
+                <w:rFonts w:ascii="Montserrat" w:hAnsi="Montserrat" w:eastAsia="Montserrat"/>
+                <w:b/>
+                <w:i w:val="0"/>
+                <w:color w:val="2A3973"/>
+                <w:sz w:val="22"/>
+              </w:rPr>
+              <w:t>Je onderzoek</w:t>
+            </w:r>
+          </w:p>
           <w:p>
             <w:pPr>
               <w:spacing w:after="60"/>
             </w:pPr>
-            <w:r/>
             <w:r>
-              <w:rPr>
-                <w:b/>
-                <w:color w:val="2A3973"/>
-                <w:sz w:val="21"/>
-              </w:rPr>
-              <w:t>E-mail van Senne</w:t>
+              <w:t>Je onderzoeksgroep in het Onderzoekslabo Jongeren &amp; Welzijn onderzoekt schermgebruik en slaap bij jongeren (het onderzoeksplan uit les 2). Jullie willen een interview met een jongerenwerker.</w:t>
             </w:r>
           </w:p>
           <w:p>
             <w:pPr>
-              <w:spacing w:after="20"/>
+              <w:spacing w:after="60"/>
             </w:pPr>
             <w:r>
               <w:rPr>
-                <w:color w:val="5F6368"/>
-                <w:sz w:val="18"/>
+                <w:b/>
               </w:rPr>
-              <w:t xml:space="preserve">Aan:  </w:t>
+              <w:t xml:space="preserve">Het interview:  </w:t>
             </w:r>
             <w:r>
-              <w:rPr>
-                <w:sz w:val="18"/>
-              </w:rPr>
-              <w:t>hanne.declercq@delantaarn.example; ines.coppens@onderzoekslabo.example</w:t>
+              <w:t>mevrouw Hanne De Clercq, jongerenwerker bij Jongerenhuis De Lantaarn  —  hanne.declercq@delantaarn.example</w:t>
             </w:r>
           </w:p>
           <w:p>
             <w:pPr>
-              <w:spacing w:after="20"/>
+              <w:spacing w:after="60"/>
             </w:pPr>
             <w:r>
               <w:rPr>
-                <w:color w:val="5F6368"/>
-                <w:sz w:val="18"/>
+                <w:b/>
               </w:rPr>
-              <w:t xml:space="preserve">Cc:  </w:t>
+              <w:t xml:space="preserve">Je onderzoeksbegeleider:  </w:t>
             </w:r>
             <w:r>
-              <w:rPr>
-                <w:sz w:val="18"/>
-              </w:rPr>
-              <w:t>—</w:t>
+              <w:t>mevrouw Ines Coppens  —  ines.coppens@onderzoekslabo.example</w:t>
             </w:r>
           </w:p>
           <w:p>
             <w:pPr>
-              <w:spacing w:after="20"/>
+              <w:spacing w:after="60"/>
             </w:pPr>
             <w:r>
               <w:rPr>
-                <w:color w:val="5F6368"/>
-                <w:sz w:val="18"/>
+                <w:b/>
               </w:rPr>
-              <w:t xml:space="preserve">Onderwerp:  </w:t>
+              <w:t xml:space="preserve">Wat je vraagt:  </w:t>
             </w:r>
             <w:r>
-              <w:rPr>
-                <w:sz w:val="18"/>
-              </w:rPr>
-              <w:t>vraagje</w:t>
+              <w:t>een interview van ongeveer 20 minuten  ·  twee mogelijke momenten: woensdag 21 oktober om 14 uur of donderdag 22 oktober om 16 uur  ·  in het jongerenhuis of online.</w:t>
             </w:r>
           </w:p>
           <w:p>
             <w:pPr>
-              <w:spacing w:before="100" w:after="0"/>
+              <w:spacing w:after="60"/>
             </w:pPr>
             <w:r>
               <w:rPr>
-                <w:sz w:val="19"/>
+                <w:b/>
               </w:rPr>
-              <w:t>hallo,</w:t>
+              <w:t xml:space="preserve">Wat er met haar antwoorden gebeurt:  </w:t>
+            </w:r>
+            <w:r>
+              <w:t>ze worden gebruikt voor een schoolonderzoek en haar naam komt niet in het verslag.</w:t>
             </w:r>
           </w:p>
           <w:p>
             <w:pPr>
-              <w:spacing w:before="100" w:after="0"/>
+              <w:spacing w:after="60"/>
             </w:pPr>
             <w:r>
               <w:rPr>
-                <w:sz w:val="19"/>
+                <w:b/>
               </w:rPr>
-              <w:t>ik zit in het 3de jaar en we moeten een interview doen voor een taak over slaap. kunt ge morgen na school?</w:t>
-            </w:r>
-          </w:p>
-          <w:p>
-            <w:pPr>
-              <w:spacing w:before="100" w:after="0"/>
-            </w:pPr>
-            <w:r>
-              <w:rPr>
-                <w:sz w:val="19"/>
-              </w:rPr>
-              <w:t>thx!! 🙂</w:t>
-            </w:r>
-          </w:p>
-          <w:p>
-            <w:pPr>
-              <w:spacing w:before="100" w:after="0"/>
-            </w:pPr>
-            <w:r>
-              <w:rPr>
-                <w:sz w:val="19"/>
-              </w:rPr>
-              <w:t>Senne</w:t>
-            </w:r>
-          </w:p>
-        </w:tc>
-        <w:tc>
-          <w:tcPr>
-            <w:tcW w:type="dxa" w:w="6123"/>
-          </w:tcPr>
-          <w:p>
-            <w:pPr>
-              <w:spacing w:after="60"/>
-            </w:pPr>
-            <w:r/>
-            <w:r>
-              <w:rPr>
-                <w:b/>
-                <w:color w:val="2A3973"/>
-                <w:sz w:val="21"/>
-              </w:rPr>
-              <w:t>E-mail van Noor</w:t>
-            </w:r>
-          </w:p>
-          <w:p>
-            <w:pPr>
-              <w:spacing w:after="20"/>
-            </w:pPr>
-            <w:r>
-              <w:rPr>
-                <w:color w:val="5F6368"/>
-                <w:sz w:val="18"/>
-              </w:rPr>
-              <w:t xml:space="preserve">Aan:  </w:t>
+              <w:t xml:space="preserve">Tegen wanneer je een antwoord hoopt:  </w:t>
             </w:r>
             <w:r>
-              <w:rPr>
-                <w:sz w:val="18"/>
-              </w:rPr>
-              <w:t>bram.willems@clb-ketel.example</w:t>
-            </w:r>
-          </w:p>
-          <w:p>
-            <w:pPr>
-              <w:spacing w:after="20"/>
-            </w:pPr>
-            <w:r>
-              <w:rPr>
-                <w:color w:val="5F6368"/>
-                <w:sz w:val="18"/>
-              </w:rPr>
-              <w:t xml:space="preserve">Cc:  </w:t>
-            </w:r>
-            <w:r>
-              <w:rPr>
-                <w:sz w:val="18"/>
-              </w:rPr>
-              <w:t>ines.coppens@onderzoekslabo.example</w:t>
-            </w:r>
-          </w:p>
-          <w:p>
-            <w:pPr>
-              <w:spacing w:after="20"/>
-            </w:pPr>
-            <w:r>
-              <w:rPr>
-                <w:color w:val="5F6368"/>
-                <w:sz w:val="18"/>
-              </w:rPr>
-              <w:t xml:space="preserve">Onderwerp:  </w:t>
-            </w:r>
-            <w:r>
-              <w:rPr>
-                <w:sz w:val="18"/>
-              </w:rPr>
-              <w:t>Vraag om een interview over groepschats – Onderzoekslabo</w:t>
-            </w:r>
-          </w:p>
-          <w:p>
-            <w:pPr>
-              <w:spacing w:before="100" w:after="0"/>
-            </w:pPr>
-            <w:r>
-              <w:rPr>
-                <w:sz w:val="19"/>
-              </w:rPr>
-              <w:t>Beste meneer Willems,</w:t>
-            </w:r>
-          </w:p>
-          <w:p>
-            <w:pPr>
-              <w:spacing w:before="100" w:after="0"/>
-            </w:pPr>
-            <w:r>
-              <w:rPr>
-                <w:sz w:val="19"/>
-              </w:rPr>
-              <w:t>Mijn naam is Noor Van Hecke en ik zit in 3MWWE van GO! Dalton Gent. Samen met mijn onderzoeksgroep onderzoek ik namens het Onderzoekslabo Jongeren &amp; Welzijn groepsdruk in groepschats.</w:t>
-            </w:r>
-          </w:p>
-          <w:p>
-            <w:pPr>
-              <w:spacing w:before="100" w:after="0"/>
-            </w:pPr>
-            <w:r>
-              <w:rPr>
-                <w:sz w:val="19"/>
-              </w:rPr>
-              <w:t>Mag ik u daarover interviewen? Het interview duurt ongeveer 20 minuten. Het kan op woensdag 28 oktober om 15 uur of op donderdag 29 oktober om 13 uur, bij het CLB of online. Uw naam komt niet in ons verslag. We gebruiken uw antwoorden alleen voor dit schoolonderzoek.</w:t>
-            </w:r>
-          </w:p>
-          <w:p>
-            <w:pPr>
-              <w:spacing w:before="100" w:after="0"/>
-            </w:pPr>
-            <w:r>
-              <w:rPr>
-                <w:sz w:val="19"/>
-              </w:rPr>
-              <w:t>Kan u mij vóór dinsdag 20 oktober laten weten welk moment past? Alvast bedankt voor uw tijd.</w:t>
-            </w:r>
-          </w:p>
-          <w:p>
-            <w:pPr>
-              <w:spacing w:before="100" w:after="0"/>
-            </w:pPr>
-            <w:r>
-              <w:rPr>
-                <w:sz w:val="19"/>
-              </w:rPr>
-              <w:t>Met vriendelijke groeten,</w:t>
-            </w:r>
-          </w:p>
-          <w:p>
-            <w:pPr>
-              <w:spacing w:before="100" w:after="0"/>
-            </w:pPr>
-            <w:r>
-              <w:rPr>
-                <w:sz w:val="19"/>
-              </w:rPr>
-              <w:t>Noor Van Hecke</w:t>
-              <w:br/>
-              <w:t>3MWWE</w:t>
-              <w:br/>
-              <w:t>Onderzoekslabo Jongeren &amp; Welzijn</w:t>
-              <w:br/>
-              <w:t>GO! Dalton Gent</w:t>
+              <w:t>maandag 19 oktober.</w:t>
             </w:r>
           </w:p>
         </w:tc>
       </w:tr>
     </w:tbl>
-    <w:p/>
     <w:p>
       <w:pPr>
-        <w:spacing w:after="120"/>
+        <w:spacing w:before="0" w:after="0" w:line="80" w:lineRule="exact"/>
+        <w:rPr>
+          <w:sz w:val="4"/>
+        </w:rPr>
       </w:pPr>
-      <w:r>
-        <w:rPr>
-          <w:b w:val="0"/>
-          <w:i w:val="0"/>
-          <w:color w:val="5F6368"/>
-          <w:sz w:val="19"/>
-        </w:rPr>
-        <w:t>Vergelijk ze per onderdeel. Rij 1 deed je leraar voor. Schrijf bij rij 2 tot 6 in de laatste kolom waarom het bij Noor beter werkt.</w:t>
-      </w:r>
-    </w:p>
-    <w:tbl>
-      <w:tblPr>
-        <w:tblStyle w:val="TableGrid"/>
-        <w:tblW w:type="auto" w:w="0"/>
-        <w:jc w:val="center"/>
-        <w:tblLayout w:type="fixed"/>
-        <w:tblLook w:firstColumn="1" w:firstRow="1" w:lastColumn="0" w:lastRow="0" w:noHBand="0" w:noVBand="1" w:val="04A0"/>
-      </w:tblPr>
-      <w:tblGrid>
-        <w:gridCol w:w="1701"/>
-        <w:gridCol w:w="1928"/>
-        <w:gridCol w:w="2494"/>
-        <w:gridCol w:w="3515"/>
-      </w:tblGrid>
-      <w:tr>
-        <w:tc>
-          <w:tcPr>
-            <w:tcW w:type="dxa" w:w="1701"/>
-            <w:shd w:val="clear" w:fill="E4E8F6"/>
-          </w:tcPr>
-          <w:p>
-            <w:r>
-              <w:rPr>
-                <w:b/>
-              </w:rPr>
-              <w:t>Onderdeel</w:t>
-            </w:r>
-          </w:p>
-        </w:tc>
-        <w:tc>
-          <w:tcPr>
-            <w:tcW w:type="dxa" w:w="1928"/>
-            <w:shd w:val="clear" w:fill="E4E8F6"/>
-          </w:tcPr>
-          <w:p>
-            <w:r>
-              <w:rPr>
-                <w:b/>
-              </w:rPr>
-              <w:t>Senne</w:t>
-            </w:r>
-          </w:p>
-        </w:tc>
-        <w:tc>
-          <w:tcPr>
-            <w:tcW w:type="dxa" w:w="2494"/>
-            <w:shd w:val="clear" w:fill="E4E8F6"/>
-          </w:tcPr>
-          <w:p>
-            <w:r>
-              <w:rPr>
-                <w:b/>
-              </w:rPr>
-              <w:t>Noor</w:t>
-            </w:r>
-          </w:p>
-        </w:tc>
-        <w:tc>
-          <w:tcPr>
-            <w:tcW w:type="dxa" w:w="3515"/>
-            <w:shd w:val="clear" w:fill="E4E8F6"/>
-          </w:tcPr>
-          <w:p>
-            <w:r>
-              <w:rPr>
-                <w:b/>
-              </w:rPr>
-              <w:t>Waarom werkt het bij Noor beter?</w:t>
-            </w:r>
-          </w:p>
-        </w:tc>
-      </w:tr>
-      <w:tr>
-        <w:trPr>
-          <w:trHeight w:val="567" w:hRule="atLeast"/>
-        </w:trPr>
-        <w:tc>
-          <w:tcPr>
-            <w:tcW w:type="dxa" w:w="1701"/>
-          </w:tcPr>
-          <w:p>
-            <w:r>
-              <w:rPr>
-                <w:b/>
-              </w:rPr>
-              <w:t>1  onderwerp</w:t>
-            </w:r>
-          </w:p>
-        </w:tc>
-        <w:tc>
-          <w:tcPr>
-            <w:tcW w:type="dxa" w:w="1928"/>
-          </w:tcPr>
-          <w:p>
-            <w:r>
-              <w:rPr>
-                <w:sz w:val="19"/>
-              </w:rPr>
-              <w:t>vraagje</w:t>
-            </w:r>
-          </w:p>
-        </w:tc>
-        <w:tc>
-          <w:tcPr>
-            <w:tcW w:type="dxa" w:w="2494"/>
-          </w:tcPr>
-          <w:p>
-            <w:r>
-              <w:rPr>
-                <w:sz w:val="19"/>
-              </w:rPr>
-              <w:t>Vraag om een interview over groepschats – Onderzoekslabo</w:t>
-            </w:r>
-          </w:p>
-        </w:tc>
-        <w:tc>
-          <w:tcPr>
-            <w:tcW w:type="dxa" w:w="3515"/>
-          </w:tcPr>
-          <w:p>
-            <w:r>
-              <w:t>Bij vraagje weet de ontvanger niet waarover het gaat. Bij Noor zie je waarover (een interview over groepschats) en van wie (Onderzoekslabo) nog voor je de e-mail opent.</w:t>
-            </w:r>
-          </w:p>
-        </w:tc>
-      </w:tr>
-      <w:tr>
-        <w:trPr>
-          <w:trHeight w:val="963" w:hRule="atLeast"/>
-        </w:trPr>
-        <w:tc>
-          <w:tcPr>
-            <w:tcW w:type="dxa" w:w="1701"/>
-          </w:tcPr>
-          <w:p>
-            <w:r>
-              <w:rPr>
-                <w:b/>
-              </w:rPr>
-              <w:t>2  aanspreking</w:t>
-            </w:r>
-          </w:p>
-        </w:tc>
-        <w:tc>
-          <w:tcPr>
-            <w:tcW w:type="dxa" w:w="1928"/>
-          </w:tcPr>
-          <w:p>
-            <w:r>
-              <w:rPr>
-                <w:sz w:val="19"/>
-              </w:rPr>
-              <w:t>hallo,</w:t>
-            </w:r>
-          </w:p>
-        </w:tc>
-        <w:tc>
-          <w:tcPr>
-            <w:tcW w:type="dxa" w:w="2494"/>
-          </w:tcPr>
-          <w:p>
-            <w:r>
-              <w:rPr>
-                <w:sz w:val="19"/>
-              </w:rPr>
-              <w:t>Beste meneer Willems,</w:t>
-            </w:r>
-          </w:p>
-        </w:tc>
-        <w:tc>
-          <w:tcPr>
-            <w:tcW w:type="dxa" w:w="3515"/>
-          </w:tcPr>
-          <w:p>
-            <w:r/>
-          </w:p>
-        </w:tc>
-      </w:tr>
-      <w:tr>
-        <w:trPr>
-          <w:trHeight w:val="963" w:hRule="atLeast"/>
-        </w:trPr>
-        <w:tc>
-          <w:tcPr>
-            <w:tcW w:type="dxa" w:w="1701"/>
-          </w:tcPr>
-          <w:p>
-            <w:r>
-              <w:rPr>
-                <w:b/>
-              </w:rPr>
-              <w:t>3  inleiding</w:t>
-            </w:r>
-          </w:p>
-        </w:tc>
-        <w:tc>
-          <w:tcPr>
-            <w:tcW w:type="dxa" w:w="1928"/>
-          </w:tcPr>
-          <w:p>
-            <w:r>
-              <w:rPr>
-                <w:sz w:val="19"/>
-              </w:rPr>
-              <w:t>ik zit in het 3de jaar en we moeten een interview doen voor een taak over slaap</w:t>
-            </w:r>
-          </w:p>
-        </w:tc>
-        <w:tc>
-          <w:tcPr>
-            <w:tcW w:type="dxa" w:w="2494"/>
-          </w:tcPr>
-          <w:p>
-            <w:r>
-              <w:rPr>
-                <w:sz w:val="19"/>
-              </w:rPr>
-              <w:t>Mijn naam is Noor Van Hecke en ik zit in 3MWWE … namens het Onderzoekslabo Jongeren &amp; Welzijn …</w:t>
-            </w:r>
-          </w:p>
-        </w:tc>
-        <w:tc>
-          <w:tcPr>
-            <w:tcW w:type="dxa" w:w="3515"/>
-          </w:tcPr>
-          <w:p>
-            <w:r/>
-          </w:p>
-        </w:tc>
-      </w:tr>
-      <w:tr>
-        <w:trPr>
-          <w:trHeight w:val="963" w:hRule="atLeast"/>
-        </w:trPr>
-        <w:tc>
-          <w:tcPr>
-            <w:tcW w:type="dxa" w:w="1701"/>
-          </w:tcPr>
-          <w:p>
-            <w:r>
-              <w:rPr>
-                <w:b/>
-              </w:rPr>
-              <w:t>4  midden: de vraag</w:t>
-            </w:r>
-          </w:p>
-        </w:tc>
-        <w:tc>
-          <w:tcPr>
-            <w:tcW w:type="dxa" w:w="1928"/>
-          </w:tcPr>
-          <w:p>
-            <w:r>
-              <w:rPr>
-                <w:sz w:val="19"/>
-              </w:rPr>
-              <w:t>kunt ge morgen na school?</w:t>
-            </w:r>
-          </w:p>
-        </w:tc>
-        <w:tc>
-          <w:tcPr>
-            <w:tcW w:type="dxa" w:w="2494"/>
-          </w:tcPr>
-          <w:p>
-            <w:r>
-              <w:rPr>
-                <w:sz w:val="19"/>
-              </w:rPr>
-              <w:t>ongeveer 20 minuten … woensdag 28 oktober om 15 uur of donderdag 29 oktober om 13 uur, bij het CLB of online … Uw naam komt niet in ons verslag</w:t>
-            </w:r>
-          </w:p>
-        </w:tc>
-        <w:tc>
-          <w:tcPr>
-            <w:tcW w:type="dxa" w:w="3515"/>
-          </w:tcPr>
-          <w:p>
-            <w:r/>
-          </w:p>
-        </w:tc>
-      </w:tr>
-      <w:tr>
-        <w:trPr>
-          <w:trHeight w:val="963" w:hRule="atLeast"/>
-        </w:trPr>
-        <w:tc>
-          <w:tcPr>
-            <w:tcW w:type="dxa" w:w="1701"/>
-          </w:tcPr>
-          <w:p>
-            <w:r>
-              <w:rPr>
-                <w:b/>
-              </w:rPr>
-              <w:t>5  slot</w:t>
-            </w:r>
-          </w:p>
-        </w:tc>
-        <w:tc>
-          <w:tcPr>
-            <w:tcW w:type="dxa" w:w="1928"/>
-          </w:tcPr>
-          <w:p>
-            <w:r>
-              <w:rPr>
-                <w:sz w:val="19"/>
-              </w:rPr>
-              <w:t>(geen slot)</w:t>
-            </w:r>
-          </w:p>
-        </w:tc>
-        <w:tc>
-          <w:tcPr>
-            <w:tcW w:type="dxa" w:w="2494"/>
-          </w:tcPr>
-          <w:p>
-            <w:r>
-              <w:rPr>
-                <w:sz w:val="19"/>
-              </w:rPr>
-              <w:t>vóór dinsdag 20 oktober … Alvast bedankt voor uw tijd.</w:t>
-            </w:r>
-          </w:p>
-        </w:tc>
-        <w:tc>
-          <w:tcPr>
-            <w:tcW w:type="dxa" w:w="3515"/>
-          </w:tcPr>
-          <w:p>
-            <w:r/>
-          </w:p>
-        </w:tc>
-      </w:tr>
-      <w:tr>
-        <w:trPr>
-          <w:trHeight w:val="963" w:hRule="atLeast"/>
-        </w:trPr>
-        <w:tc>
-          <w:tcPr>
-            <w:tcW w:type="dxa" w:w="1701"/>
-          </w:tcPr>
-          <w:p>
-            <w:r>
-              <w:rPr>
-                <w:b/>
-              </w:rPr>
-              <w:t>6  slotgroet en handtekening</w:t>
-            </w:r>
-          </w:p>
-        </w:tc>
-        <w:tc>
-          <w:tcPr>
-            <w:tcW w:type="dxa" w:w="1928"/>
-          </w:tcPr>
-          <w:p>
-            <w:r>
-              <w:rPr>
-                <w:sz w:val="19"/>
-              </w:rPr>
-              <w:t>thx!! 🙂  Senne</w:t>
-            </w:r>
-          </w:p>
-        </w:tc>
-        <w:tc>
-          <w:tcPr>
-            <w:tcW w:type="dxa" w:w="2494"/>
-          </w:tcPr>
-          <w:p>
-            <w:r>
-              <w:rPr>
-                <w:sz w:val="19"/>
-              </w:rPr>
-              <w:t>Met vriendelijke groeten, Noor Van Hecke, 3MWWE, Onderzoekslabo Jongeren &amp; Welzijn, GO! Dalton Gent</w:t>
-            </w:r>
-          </w:p>
-        </w:tc>
-        <w:tc>
-          <w:tcPr>
-            <w:tcW w:type="dxa" w:w="3515"/>
-          </w:tcPr>
-          <w:p>
-            <w:r/>
-          </w:p>
-        </w:tc>
-      </w:tr>
-    </w:tbl>
-    <w:p/>
-    <w:p>
-      <w:pPr>
-        <w:keepNext/>
-        <w:spacing w:before="280" w:after="80"/>
-      </w:pPr>
-      <w:r>
-        <w:rPr>
-          <w:b/>
-          <w:color w:val="2A3973"/>
-          <w:sz w:val="32"/>
-        </w:rPr>
-        <w:t>Deel 2 — Aan, Cc of Bcc?</w:t>
-      </w:r>
-    </w:p>
-    <w:p>
-      <w:pPr>
-        <w:spacing w:after="120"/>
-      </w:pPr>
-      <w:r>
-        <w:rPr>
-          <w:b w:val="0"/>
-          <w:i w:val="0"/>
-          <w:color w:val="5F6368"/>
-          <w:sz w:val="19"/>
-        </w:rPr>
-        <w:t>Schrijf bij elke situatie Aan, Cc of Bcc.</w:t>
-      </w:r>
-    </w:p>
-    <w:tbl>
-      <w:tblPr>
-        <w:tblStyle w:val="TableGrid"/>
-        <w:tblW w:type="auto" w:w="0"/>
-        <w:jc w:val="center"/>
-        <w:tblLayout w:type="fixed"/>
-        <w:tblLook w:firstColumn="1" w:firstRow="1" w:lastColumn="0" w:lastRow="0" w:noHBand="0" w:noVBand="1" w:val="04A0"/>
-      </w:tblPr>
-      <w:tblGrid>
-        <w:gridCol w:w="7087"/>
-        <w:gridCol w:w="2551"/>
-      </w:tblGrid>
-      <w:tr>
-        <w:tc>
-          <w:tcPr>
-            <w:tcW w:type="dxa" w:w="7087"/>
-            <w:shd w:val="clear" w:fill="E4E8F6"/>
-          </w:tcPr>
-          <w:p>
-            <w:r>
-              <w:rPr>
-                <w:b/>
-              </w:rPr>
-              <w:t>Situatie</w:t>
-            </w:r>
-          </w:p>
-        </w:tc>
-        <w:tc>
-          <w:tcPr>
-            <w:tcW w:type="dxa" w:w="2551"/>
-            <w:shd w:val="clear" w:fill="E4E8F6"/>
-          </w:tcPr>
-          <w:p>
-            <w:r>
-              <w:rPr>
-                <w:b/>
-              </w:rPr>
-              <w:t>Aan, Cc of Bcc?</w:t>
-            </w:r>
-          </w:p>
-        </w:tc>
-      </w:tr>
-      <w:tr>
-        <w:trPr>
-          <w:trHeight w:val="510" w:hRule="atLeast"/>
-        </w:trPr>
-        <w:tc>
-          <w:tcPr>
-            <w:tcW w:type="dxa" w:w="7087"/>
-          </w:tcPr>
-          <w:p>
-            <w:r>
-              <w:t>a.  Je mailt de jongerenwerker die je wil interviewen.</w:t>
-            </w:r>
-          </w:p>
-        </w:tc>
-        <w:tc>
-          <w:tcPr>
-            <w:tcW w:type="dxa" w:w="2551"/>
-          </w:tcPr>
-          <w:p/>
-        </w:tc>
-      </w:tr>
-      <w:tr>
-        <w:trPr>
-          <w:trHeight w:val="510" w:hRule="atLeast"/>
-        </w:trPr>
-        <w:tc>
-          <w:tcPr>
-            <w:tcW w:type="dxa" w:w="7087"/>
-          </w:tcPr>
-          <w:p>
-            <w:r>
-              <w:t>b.  Je onderzoeksbegeleider wil je e-mail lezen, maar moet zelf niets doen.</w:t>
-            </w:r>
-          </w:p>
-        </w:tc>
-        <w:tc>
-          <w:tcPr>
-            <w:tcW w:type="dxa" w:w="2551"/>
-          </w:tcPr>
-          <w:p/>
-        </w:tc>
-      </w:tr>
-      <w:tr>
-        <w:trPr>
-          <w:trHeight w:val="510" w:hRule="atLeast"/>
-        </w:trPr>
-        <w:tc>
-          <w:tcPr>
-            <w:tcW w:type="dxa" w:w="7087"/>
-          </w:tcPr>
-          <w:p>
-            <w:r>
-              <w:t>c.  Je nodigt 24 leerlingen van het 4de jaar uit voor je enquête. Ze mogen elkaars e-mailadres niet zien.</w:t>
-            </w:r>
-          </w:p>
-        </w:tc>
-        <w:tc>
-          <w:tcPr>
-            <w:tcW w:type="dxa" w:w="2551"/>
-          </w:tcPr>
-          <w:p/>
-        </w:tc>
-      </w:tr>
-      <w:tr>
-        <w:trPr>
-          <w:trHeight w:val="510" w:hRule="atLeast"/>
-        </w:trPr>
-        <w:tc>
-          <w:tcPr>
-            <w:tcW w:type="dxa" w:w="7087"/>
-          </w:tcPr>
-          <w:p>
-            <w:r>
-              <w:t>d.  Je twee groepsgenoten moeten weten wat je vroeg.</w:t>
-            </w:r>
-          </w:p>
-        </w:tc>
-        <w:tc>
-          <w:tcPr>
-            <w:tcW w:type="dxa" w:w="2551"/>
-          </w:tcPr>
-          <w:p/>
-        </w:tc>
-      </w:tr>
-    </w:tbl>
-    <w:p/>
-    <w:p>
-      <w:pPr>
-        <w:spacing w:after="120"/>
-      </w:pPr>
-      <w:r>
-        <w:rPr>
-          <w:b/>
-          <w:i w:val="0"/>
-        </w:rPr>
-        <w:t>Vraag 1. Waarom zet je de 24 leerlingen niet in Cc?</w:t>
-      </w:r>
-    </w:p>
-    <w:p>
-      <w:pPr>
-        <w:spacing w:after="40"/>
-      </w:pPr>
-      <w:r>
-        <w:t>______________________________________________________________________</w:t>
-      </w:r>
-    </w:p>
-    <w:p>
-      <w:pPr>
-        <w:spacing w:after="40"/>
-      </w:pPr>
-      <w:r>
-        <w:t>______________________________________________________________________</w:t>
-      </w:r>
     </w:p>
     <w:p>
       <w:pPr>
         <w:keepNext/>
-        <w:spacing w:before="280" w:after="80"/>
+        <w:pageBreakBefore w:val="0"/>
+        <w:spacing w:before="280" w:after="160"/>
+        <w:pBdr>
+          <w:bottom w:val="single" w:sz="6" w:space="3" w:color="A7B1DE"/>
+        </w:pBdr>
       </w:pPr>
       <w:r>
         <w:rPr>
+          <w:rFonts w:ascii="Montserrat" w:hAnsi="Montserrat" w:eastAsia="Montserrat"/>
           <w:b/>
+          <w:i w:val="0"/>
           <w:color w:val="2A3973"/>
-          <w:sz w:val="32"/>
+          <w:sz w:val="28"/>
         </w:rPr>
-        <w:t>Deel 3 — Mijn interviewaanvraag</w:t>
-      </w:r>
-    </w:p>
-    <w:p>
-      <w:pPr>
-        <w:spacing w:after="120"/>
-      </w:pPr>
-      <w:r>
-        <w:rPr>
-          <w:b w:val="0"/>
-          <w:i w:val="0"/>
-          <w:color w:val="5F6368"/>
-          <w:sz w:val="19"/>
-        </w:rPr>
-        <w:t>Schrijf de e-mail die Senne had moeten sturen, maar met jouw naam. Klik in een vak en typ. De grijze woorden links zeggen wat in elk vak hoort. Laat Bcc leeg.</w:t>
+        <w:t>Deel 1 — Goed of zwak?</w:t>
       </w:r>
     </w:p>
     <w:tbl>
@@ -1162,30 +297,961 @@
         <w:tblLayout w:type="fixed"/>
         <w:tblLook w:firstColumn="1" w:firstRow="1" w:lastColumn="0" w:lastRow="0" w:noHBand="0" w:noVBand="1" w:val="04A0"/>
         <w:tblBorders>
-          <w:top w:val="single" w:sz="8" w:color="9AA0A6"/>
-          <w:left w:val="single" w:sz="8" w:color="9AA0A6"/>
-          <w:bottom w:val="single" w:sz="8" w:color="9AA0A6"/>
-          <w:right w:val="single" w:sz="8" w:color="9AA0A6"/>
-          <w:insideH w:val="nil"/>
-          <w:insideV w:val="nil"/>
+          <w:top w:val="single" w:sz="6" w:space="0" w:color="A7B1DE"/>
+          <w:left w:val="single" w:sz="6" w:space="0" w:color="A7B1DE"/>
+          <w:bottom w:val="single" w:sz="6" w:space="0" w:color="A7B1DE"/>
+          <w:right w:val="single" w:sz="6" w:space="0" w:color="A7B1DE"/>
+          <w:insideH w:val="single" w:sz="6" w:space="0" w:color="D5DAEE"/>
+          <w:insideV w:val="single" w:sz="6" w:space="0" w:color="D5DAEE"/>
         </w:tblBorders>
+        <w:tblLayout w:type="fixed"/>
+      </w:tblPr>
+      <w:tblGrid>
+        <w:gridCol w:w="1474"/>
+        <w:gridCol w:w="1701"/>
+        <w:gridCol w:w="2494"/>
+        <w:gridCol w:w="3969"/>
+      </w:tblGrid>
+      <w:tr>
+        <w:trPr>
+          <w:cantSplit/>
+        </w:trPr>
+        <w:tc>
+          <w:tcPr>
+            <w:tcW w:type="dxa" w:w="1474"/>
+            <w:shd w:val="clear" w:color="auto" w:fill="E4E8F6"/>
+          </w:tcPr>
+          <w:p>
+            <w:pPr>
+              <w:spacing w:before="0" w:after="0"/>
+            </w:pPr>
+            <w:r/>
+            <w:r>
+              <w:rPr>
+                <w:b/>
+                <w:i w:val="0"/>
+                <w:color w:val="2A3973"/>
+                <w:sz w:val="22"/>
+              </w:rPr>
+              <w:t>Onderdeel</w:t>
+            </w:r>
+          </w:p>
+        </w:tc>
+        <w:tc>
+          <w:tcPr>
+            <w:tcW w:type="dxa" w:w="1701"/>
+            <w:shd w:val="clear" w:color="auto" w:fill="E4E8F6"/>
+          </w:tcPr>
+          <w:p>
+            <w:pPr>
+              <w:spacing w:before="0" w:after="0"/>
+            </w:pPr>
+            <w:r/>
+            <w:r>
+              <w:rPr>
+                <w:b/>
+                <w:i w:val="0"/>
+                <w:color w:val="2A3973"/>
+                <w:sz w:val="22"/>
+              </w:rPr>
+              <w:t>Senne</w:t>
+            </w:r>
+          </w:p>
+        </w:tc>
+        <w:tc>
+          <w:tcPr>
+            <w:tcW w:type="dxa" w:w="2494"/>
+            <w:shd w:val="clear" w:color="auto" w:fill="E4E8F6"/>
+          </w:tcPr>
+          <w:p>
+            <w:pPr>
+              <w:spacing w:before="0" w:after="0"/>
+            </w:pPr>
+            <w:r/>
+            <w:r>
+              <w:rPr>
+                <w:b/>
+                <w:i w:val="0"/>
+                <w:color w:val="2A3973"/>
+                <w:sz w:val="22"/>
+              </w:rPr>
+              <w:t>Noor</w:t>
+            </w:r>
+          </w:p>
+        </w:tc>
+        <w:tc>
+          <w:tcPr>
+            <w:tcW w:type="dxa" w:w="3969"/>
+            <w:shd w:val="clear" w:color="auto" w:fill="E4E8F6"/>
+          </w:tcPr>
+          <w:p>
+            <w:pPr>
+              <w:spacing w:before="0" w:after="0"/>
+            </w:pPr>
+            <w:r/>
+            <w:r>
+              <w:rPr>
+                <w:b/>
+                <w:i w:val="0"/>
+                <w:color w:val="2A3973"/>
+                <w:sz w:val="22"/>
+              </w:rPr>
+              <w:t>Waarom werkt het bij Noor beter?</w:t>
+            </w:r>
+          </w:p>
+        </w:tc>
+      </w:tr>
+      <w:tr>
+        <w:trPr>
+          <w:trHeight w:val="680" w:hRule="atLeast"/>
+          <w:cantSplit/>
+        </w:trPr>
+        <w:tc>
+          <w:tcPr>
+            <w:tcW w:type="dxa" w:w="1474"/>
+            <w:vAlign w:val="center"/>
+          </w:tcPr>
+          <w:p>
+            <w:pPr>
+              <w:spacing w:before="0" w:after="0"/>
+            </w:pPr>
+            <w:r/>
+            <w:r>
+              <w:rPr>
+                <w:b/>
+                <w:i w:val="0"/>
+                <w:color w:val="5F6368"/>
+                <w:sz w:val="20"/>
+              </w:rPr>
+              <w:t>1  onderwerp</w:t>
+            </w:r>
+          </w:p>
+        </w:tc>
+        <w:tc>
+          <w:tcPr>
+            <w:tcW w:type="dxa" w:w="1701"/>
+            <w:vAlign w:val="center"/>
+          </w:tcPr>
+          <w:p>
+            <w:pPr>
+              <w:spacing w:before="0" w:after="0"/>
+            </w:pPr>
+            <w:r/>
+            <w:r>
+              <w:rPr>
+                <w:b w:val="0"/>
+                <w:i w:val="0"/>
+                <w:color w:val="5F6368"/>
+                <w:sz w:val="20"/>
+              </w:rPr>
+              <w:t>vraagje</w:t>
+            </w:r>
+          </w:p>
+        </w:tc>
+        <w:tc>
+          <w:tcPr>
+            <w:tcW w:type="dxa" w:w="2494"/>
+            <w:vAlign w:val="center"/>
+          </w:tcPr>
+          <w:p>
+            <w:pPr>
+              <w:spacing w:before="0" w:after="0"/>
+            </w:pPr>
+            <w:r/>
+            <w:r>
+              <w:rPr>
+                <w:b w:val="0"/>
+                <w:i w:val="0"/>
+                <w:color w:val="5F6368"/>
+                <w:sz w:val="20"/>
+              </w:rPr>
+              <w:t>Vraag om een interview over groepschats – Onderzoekslabo</w:t>
+            </w:r>
+          </w:p>
+        </w:tc>
+        <w:tc>
+          <w:tcPr>
+            <w:tcW w:type="dxa" w:w="3969"/>
+            <w:vAlign w:val="center"/>
+          </w:tcPr>
+          <w:p>
+            <w:pPr>
+              <w:spacing w:before="0" w:after="0"/>
+            </w:pPr>
+            <w:r/>
+            <w:r>
+              <w:rPr>
+                <w:b w:val="0"/>
+                <w:i/>
+                <w:color w:val="5F6368"/>
+                <w:sz w:val="20"/>
+              </w:rPr>
+              <w:t>Bij vraagje weet de ontvanger niet waarover het gaat. Bij Noor zie je waarover (een interview over groepschats) en van wie (Onderzoekslabo) nog voor je de e-mail opent.</w:t>
+            </w:r>
+          </w:p>
+        </w:tc>
+      </w:tr>
+      <w:tr>
+        <w:trPr>
+          <w:trHeight w:val="680" w:hRule="atLeast"/>
+          <w:cantSplit/>
+        </w:trPr>
+        <w:tc>
+          <w:tcPr>
+            <w:tcW w:type="dxa" w:w="1474"/>
+            <w:vAlign w:val="center"/>
+          </w:tcPr>
+          <w:p>
+            <w:pPr>
+              <w:spacing w:before="0" w:after="0"/>
+            </w:pPr>
+            <w:r/>
+            <w:r>
+              <w:rPr>
+                <w:b/>
+                <w:i w:val="0"/>
+                <w:sz w:val="20"/>
+              </w:rPr>
+              <w:t>2  aanspreking</w:t>
+            </w:r>
+          </w:p>
+        </w:tc>
+        <w:tc>
+          <w:tcPr>
+            <w:tcW w:type="dxa" w:w="1701"/>
+            <w:vAlign w:val="center"/>
+          </w:tcPr>
+          <w:p>
+            <w:pPr>
+              <w:spacing w:before="0" w:after="0"/>
+            </w:pPr>
+            <w:r/>
+            <w:r>
+              <w:rPr>
+                <w:b w:val="0"/>
+                <w:i w:val="0"/>
+                <w:sz w:val="20"/>
+              </w:rPr>
+              <w:t>hallo,</w:t>
+            </w:r>
+          </w:p>
+        </w:tc>
+        <w:tc>
+          <w:tcPr>
+            <w:tcW w:type="dxa" w:w="2494"/>
+            <w:vAlign w:val="center"/>
+          </w:tcPr>
+          <w:p>
+            <w:pPr>
+              <w:spacing w:before="0" w:after="0"/>
+            </w:pPr>
+            <w:r/>
+            <w:r>
+              <w:rPr>
+                <w:b w:val="0"/>
+                <w:i w:val="0"/>
+                <w:sz w:val="20"/>
+              </w:rPr>
+              <w:t>Beste meneer Willems,</w:t>
+            </w:r>
+          </w:p>
+        </w:tc>
+        <w:tc>
+          <w:tcPr>
+            <w:tcW w:type="dxa" w:w="3969"/>
+            <w:vAlign w:val="center"/>
+            <w:shd w:val="clear" w:color="auto" w:fill="F3F5FC"/>
+          </w:tcPr>
+          <w:p>
+            <w:pPr>
+              <w:spacing w:before="0" w:after="0"/>
+            </w:pPr>
+          </w:p>
+        </w:tc>
+      </w:tr>
+      <w:tr>
+        <w:trPr>
+          <w:trHeight w:val="680" w:hRule="atLeast"/>
+          <w:cantSplit/>
+        </w:trPr>
+        <w:tc>
+          <w:tcPr>
+            <w:tcW w:type="dxa" w:w="1474"/>
+            <w:vAlign w:val="center"/>
+          </w:tcPr>
+          <w:p>
+            <w:pPr>
+              <w:spacing w:before="0" w:after="0"/>
+            </w:pPr>
+            <w:r/>
+            <w:r>
+              <w:rPr>
+                <w:b/>
+                <w:i w:val="0"/>
+                <w:sz w:val="20"/>
+              </w:rPr>
+              <w:t>3  inleiding</w:t>
+            </w:r>
+          </w:p>
+        </w:tc>
+        <w:tc>
+          <w:tcPr>
+            <w:tcW w:type="dxa" w:w="1701"/>
+            <w:vAlign w:val="center"/>
+          </w:tcPr>
+          <w:p>
+            <w:pPr>
+              <w:spacing w:before="0" w:after="0"/>
+            </w:pPr>
+            <w:r/>
+            <w:r>
+              <w:rPr>
+                <w:b w:val="0"/>
+                <w:i w:val="0"/>
+                <w:sz w:val="20"/>
+              </w:rPr>
+              <w:t>ik zit in het 3de jaar en we moeten een interview doen voor een taak over slaap</w:t>
+            </w:r>
+          </w:p>
+        </w:tc>
+        <w:tc>
+          <w:tcPr>
+            <w:tcW w:type="dxa" w:w="2494"/>
+            <w:vAlign w:val="center"/>
+          </w:tcPr>
+          <w:p>
+            <w:pPr>
+              <w:spacing w:before="0" w:after="0"/>
+            </w:pPr>
+            <w:r/>
+            <w:r>
+              <w:rPr>
+                <w:b w:val="0"/>
+                <w:i w:val="0"/>
+                <w:sz w:val="20"/>
+              </w:rPr>
+              <w:t>Mijn naam is Noor Van Hecke en ik zit in 3MWWE … namens het Onderzoekslabo Jongeren &amp; Welzijn …</w:t>
+            </w:r>
+          </w:p>
+        </w:tc>
+        <w:tc>
+          <w:tcPr>
+            <w:tcW w:type="dxa" w:w="3969"/>
+            <w:vAlign w:val="center"/>
+            <w:shd w:val="clear" w:color="auto" w:fill="F3F5FC"/>
+          </w:tcPr>
+          <w:p>
+            <w:pPr>
+              <w:spacing w:before="0" w:after="0"/>
+            </w:pPr>
+          </w:p>
+        </w:tc>
+      </w:tr>
+      <w:tr>
+        <w:trPr>
+          <w:trHeight w:val="680" w:hRule="atLeast"/>
+          <w:cantSplit/>
+        </w:trPr>
+        <w:tc>
+          <w:tcPr>
+            <w:tcW w:type="dxa" w:w="1474"/>
+            <w:vAlign w:val="center"/>
+          </w:tcPr>
+          <w:p>
+            <w:pPr>
+              <w:spacing w:before="0" w:after="0"/>
+            </w:pPr>
+            <w:r/>
+            <w:r>
+              <w:rPr>
+                <w:b/>
+                <w:i w:val="0"/>
+                <w:sz w:val="20"/>
+              </w:rPr>
+              <w:t>4  midden: de vraag</w:t>
+            </w:r>
+          </w:p>
+        </w:tc>
+        <w:tc>
+          <w:tcPr>
+            <w:tcW w:type="dxa" w:w="1701"/>
+            <w:vAlign w:val="center"/>
+          </w:tcPr>
+          <w:p>
+            <w:pPr>
+              <w:spacing w:before="0" w:after="0"/>
+            </w:pPr>
+            <w:r/>
+            <w:r>
+              <w:rPr>
+                <w:b w:val="0"/>
+                <w:i w:val="0"/>
+                <w:sz w:val="20"/>
+              </w:rPr>
+              <w:t>kunt ge morgen na school?</w:t>
+            </w:r>
+          </w:p>
+        </w:tc>
+        <w:tc>
+          <w:tcPr>
+            <w:tcW w:type="dxa" w:w="2494"/>
+            <w:vAlign w:val="center"/>
+          </w:tcPr>
+          <w:p>
+            <w:pPr>
+              <w:spacing w:before="0" w:after="0"/>
+            </w:pPr>
+            <w:r/>
+            <w:r>
+              <w:rPr>
+                <w:b w:val="0"/>
+                <w:i w:val="0"/>
+                <w:sz w:val="20"/>
+              </w:rPr>
+              <w:t>ongeveer 20 minuten … woensdag 28 oktober om 15 uur of donderdag 29 oktober om 13 uur, bij het CLB of online … Uw naam komt niet in ons verslag</w:t>
+            </w:r>
+          </w:p>
+        </w:tc>
+        <w:tc>
+          <w:tcPr>
+            <w:tcW w:type="dxa" w:w="3969"/>
+            <w:vAlign w:val="center"/>
+            <w:shd w:val="clear" w:color="auto" w:fill="F3F5FC"/>
+          </w:tcPr>
+          <w:p>
+            <w:pPr>
+              <w:spacing w:before="0" w:after="0"/>
+            </w:pPr>
+          </w:p>
+        </w:tc>
+      </w:tr>
+      <w:tr>
+        <w:trPr>
+          <w:trHeight w:val="680" w:hRule="atLeast"/>
+          <w:cantSplit/>
+        </w:trPr>
+        <w:tc>
+          <w:tcPr>
+            <w:tcW w:type="dxa" w:w="1474"/>
+            <w:vAlign w:val="center"/>
+          </w:tcPr>
+          <w:p>
+            <w:pPr>
+              <w:spacing w:before="0" w:after="0"/>
+            </w:pPr>
+            <w:r/>
+            <w:r>
+              <w:rPr>
+                <w:b/>
+                <w:i w:val="0"/>
+                <w:sz w:val="20"/>
+              </w:rPr>
+              <w:t>5  slot</w:t>
+            </w:r>
+          </w:p>
+        </w:tc>
+        <w:tc>
+          <w:tcPr>
+            <w:tcW w:type="dxa" w:w="1701"/>
+            <w:vAlign w:val="center"/>
+          </w:tcPr>
+          <w:p>
+            <w:pPr>
+              <w:spacing w:before="0" w:after="0"/>
+            </w:pPr>
+            <w:r/>
+            <w:r>
+              <w:rPr>
+                <w:b w:val="0"/>
+                <w:i w:val="0"/>
+                <w:sz w:val="20"/>
+              </w:rPr>
+              <w:t>(geen slot)</w:t>
+            </w:r>
+          </w:p>
+        </w:tc>
+        <w:tc>
+          <w:tcPr>
+            <w:tcW w:type="dxa" w:w="2494"/>
+            <w:vAlign w:val="center"/>
+          </w:tcPr>
+          <w:p>
+            <w:pPr>
+              <w:spacing w:before="0" w:after="0"/>
+            </w:pPr>
+            <w:r/>
+            <w:r>
+              <w:rPr>
+                <w:b w:val="0"/>
+                <w:i w:val="0"/>
+                <w:sz w:val="20"/>
+              </w:rPr>
+              <w:t>vóór dinsdag 20 oktober … Alvast bedankt voor uw tijd.</w:t>
+            </w:r>
+          </w:p>
+        </w:tc>
+        <w:tc>
+          <w:tcPr>
+            <w:tcW w:type="dxa" w:w="3969"/>
+            <w:vAlign w:val="center"/>
+            <w:shd w:val="clear" w:color="auto" w:fill="F3F5FC"/>
+          </w:tcPr>
+          <w:p>
+            <w:pPr>
+              <w:spacing w:before="0" w:after="0"/>
+            </w:pPr>
+          </w:p>
+        </w:tc>
+      </w:tr>
+      <w:tr>
+        <w:trPr>
+          <w:trHeight w:val="680" w:hRule="atLeast"/>
+          <w:cantSplit/>
+        </w:trPr>
+        <w:tc>
+          <w:tcPr>
+            <w:tcW w:type="dxa" w:w="1474"/>
+            <w:vAlign w:val="center"/>
+          </w:tcPr>
+          <w:p>
+            <w:pPr>
+              <w:spacing w:before="0" w:after="0"/>
+            </w:pPr>
+            <w:r/>
+            <w:r>
+              <w:rPr>
+                <w:b/>
+                <w:i w:val="0"/>
+                <w:sz w:val="20"/>
+              </w:rPr>
+              <w:t>6  slotgroet en handtekening</w:t>
+            </w:r>
+          </w:p>
+        </w:tc>
+        <w:tc>
+          <w:tcPr>
+            <w:tcW w:type="dxa" w:w="1701"/>
+            <w:vAlign w:val="center"/>
+          </w:tcPr>
+          <w:p>
+            <w:pPr>
+              <w:spacing w:before="0" w:after="0"/>
+            </w:pPr>
+            <w:r/>
+            <w:r>
+              <w:rPr>
+                <w:b w:val="0"/>
+                <w:i w:val="0"/>
+                <w:sz w:val="20"/>
+              </w:rPr>
+              <w:t>thx!! 🙂  Senne</w:t>
+            </w:r>
+          </w:p>
+        </w:tc>
+        <w:tc>
+          <w:tcPr>
+            <w:tcW w:type="dxa" w:w="2494"/>
+            <w:vAlign w:val="center"/>
+          </w:tcPr>
+          <w:p>
+            <w:pPr>
+              <w:spacing w:before="0" w:after="0"/>
+            </w:pPr>
+            <w:r/>
+            <w:r>
+              <w:rPr>
+                <w:b w:val="0"/>
+                <w:i w:val="0"/>
+                <w:sz w:val="20"/>
+              </w:rPr>
+              <w:t>Met vriendelijke groeten, Noor Van Hecke, 3MWWE, Onderzoekslabo Jongeren &amp; Welzijn, GO! Dalton Gent</w:t>
+            </w:r>
+          </w:p>
+        </w:tc>
+        <w:tc>
+          <w:tcPr>
+            <w:tcW w:type="dxa" w:w="3969"/>
+            <w:vAlign w:val="center"/>
+            <w:shd w:val="clear" w:color="auto" w:fill="F3F5FC"/>
+          </w:tcPr>
+          <w:p>
+            <w:pPr>
+              <w:spacing w:before="0" w:after="0"/>
+            </w:pPr>
+          </w:p>
+        </w:tc>
+      </w:tr>
+    </w:tbl>
+    <w:p>
+      <w:pPr>
+        <w:spacing w:before="0" w:after="0" w:line="80" w:lineRule="exact"/>
+        <w:rPr>
+          <w:sz w:val="4"/>
+        </w:rPr>
+      </w:pPr>
+    </w:p>
+    <w:p>
+      <w:pPr>
+        <w:keepNext/>
+        <w:pageBreakBefore w:val="0"/>
+        <w:spacing w:before="280" w:after="160"/>
+        <w:pBdr>
+          <w:bottom w:val="single" w:sz="6" w:space="3" w:color="A7B1DE"/>
+        </w:pBdr>
+      </w:pPr>
+      <w:r>
+        <w:rPr>
+          <w:rFonts w:ascii="Montserrat" w:hAnsi="Montserrat" w:eastAsia="Montserrat"/>
+          <w:b/>
+          <w:i w:val="0"/>
+          <w:color w:val="2A3973"/>
+          <w:sz w:val="28"/>
+        </w:rPr>
+        <w:t>Deel 2 — Aan, Cc of Bcc?</w:t>
+      </w:r>
+    </w:p>
+    <w:tbl>
+      <w:tblPr>
+        <w:tblW w:type="auto" w:w="0"/>
+        <w:jc w:val="center"/>
+        <w:tblLayout w:type="fixed"/>
+        <w:tblLook w:firstColumn="1" w:firstRow="1" w:lastColumn="0" w:lastRow="0" w:noHBand="0" w:noVBand="1" w:val="04A0"/>
+        <w:tblBorders>
+          <w:top w:val="single" w:sz="6" w:space="0" w:color="A7B1DE"/>
+          <w:left w:val="single" w:sz="6" w:space="0" w:color="A7B1DE"/>
+          <w:bottom w:val="single" w:sz="6" w:space="0" w:color="A7B1DE"/>
+          <w:right w:val="single" w:sz="6" w:space="0" w:color="A7B1DE"/>
+          <w:insideH w:val="single" w:sz="6" w:space="0" w:color="D5DAEE"/>
+          <w:insideV w:val="single" w:sz="6" w:space="0" w:color="D5DAEE"/>
+        </w:tblBorders>
+        <w:tblLayout w:type="fixed"/>
+      </w:tblPr>
+      <w:tblGrid>
+        <w:gridCol w:w="7143"/>
+        <w:gridCol w:w="2494"/>
+      </w:tblGrid>
+      <w:tr>
+        <w:trPr>
+          <w:cantSplit/>
+        </w:trPr>
+        <w:tc>
+          <w:tcPr>
+            <w:tcW w:type="dxa" w:w="7143"/>
+            <w:shd w:val="clear" w:color="auto" w:fill="E4E8F6"/>
+          </w:tcPr>
+          <w:p>
+            <w:pPr>
+              <w:spacing w:before="0" w:after="0"/>
+            </w:pPr>
+            <w:r/>
+            <w:r>
+              <w:rPr>
+                <w:b/>
+                <w:i w:val="0"/>
+                <w:color w:val="2A3973"/>
+                <w:sz w:val="22"/>
+              </w:rPr>
+              <w:t>Situatie</w:t>
+            </w:r>
+          </w:p>
+        </w:tc>
+        <w:tc>
+          <w:tcPr>
+            <w:tcW w:type="dxa" w:w="2494"/>
+            <w:shd w:val="clear" w:color="auto" w:fill="E4E8F6"/>
+          </w:tcPr>
+          <w:p>
+            <w:pPr>
+              <w:spacing w:before="0" w:after="0"/>
+            </w:pPr>
+            <w:r/>
+            <w:r>
+              <w:rPr>
+                <w:b/>
+                <w:i w:val="0"/>
+                <w:color w:val="2A3973"/>
+                <w:sz w:val="22"/>
+              </w:rPr>
+              <w:t>Aan, Cc of Bcc?</w:t>
+            </w:r>
+          </w:p>
+        </w:tc>
+      </w:tr>
+      <w:tr>
+        <w:trPr>
+          <w:trHeight w:val="567" w:hRule="atLeast"/>
+          <w:cantSplit/>
+        </w:trPr>
+        <w:tc>
+          <w:tcPr>
+            <w:tcW w:type="dxa" w:w="7143"/>
+            <w:vAlign w:val="center"/>
+          </w:tcPr>
+          <w:p>
+            <w:pPr>
+              <w:spacing w:before="0" w:after="0"/>
+            </w:pPr>
+            <w:r/>
+            <w:r>
+              <w:rPr>
+                <w:b w:val="0"/>
+                <w:i w:val="0"/>
+              </w:rPr>
+              <w:t>a.  Je mailt de jongerenwerker die je wil interviewen.</w:t>
+            </w:r>
+          </w:p>
+        </w:tc>
+        <w:tc>
+          <w:tcPr>
+            <w:tcW w:type="dxa" w:w="2494"/>
+            <w:vAlign w:val="center"/>
+            <w:shd w:val="clear" w:color="auto" w:fill="F3F5FC"/>
+          </w:tcPr>
+          <w:p>
+            <w:pPr>
+              <w:spacing w:before="0" w:after="0"/>
+            </w:pPr>
+          </w:p>
+        </w:tc>
+      </w:tr>
+      <w:tr>
+        <w:trPr>
+          <w:trHeight w:val="567" w:hRule="atLeast"/>
+          <w:cantSplit/>
+        </w:trPr>
+        <w:tc>
+          <w:tcPr>
+            <w:tcW w:type="dxa" w:w="7143"/>
+            <w:vAlign w:val="center"/>
+          </w:tcPr>
+          <w:p>
+            <w:pPr>
+              <w:spacing w:before="0" w:after="0"/>
+            </w:pPr>
+            <w:r/>
+            <w:r>
+              <w:rPr>
+                <w:b w:val="0"/>
+                <w:i w:val="0"/>
+              </w:rPr>
+              <w:t>b.  Je onderzoeksbegeleider wil je e-mail lezen, maar moet zelf niets doen.</w:t>
+            </w:r>
+          </w:p>
+        </w:tc>
+        <w:tc>
+          <w:tcPr>
+            <w:tcW w:type="dxa" w:w="2494"/>
+            <w:vAlign w:val="center"/>
+            <w:shd w:val="clear" w:color="auto" w:fill="F3F5FC"/>
+          </w:tcPr>
+          <w:p>
+            <w:pPr>
+              <w:spacing w:before="0" w:after="0"/>
+            </w:pPr>
+          </w:p>
+        </w:tc>
+      </w:tr>
+      <w:tr>
+        <w:trPr>
+          <w:trHeight w:val="567" w:hRule="atLeast"/>
+          <w:cantSplit/>
+        </w:trPr>
+        <w:tc>
+          <w:tcPr>
+            <w:tcW w:type="dxa" w:w="7143"/>
+            <w:vAlign w:val="center"/>
+          </w:tcPr>
+          <w:p>
+            <w:pPr>
+              <w:spacing w:before="0" w:after="0"/>
+            </w:pPr>
+            <w:r/>
+            <w:r>
+              <w:rPr>
+                <w:b w:val="0"/>
+                <w:i w:val="0"/>
+              </w:rPr>
+              <w:t>c.  Je nodigt 24 leerlingen van het 4de jaar uit voor je enquête. Ze mogen elkaars e-mailadres niet zien.</w:t>
+            </w:r>
+          </w:p>
+        </w:tc>
+        <w:tc>
+          <w:tcPr>
+            <w:tcW w:type="dxa" w:w="2494"/>
+            <w:vAlign w:val="center"/>
+            <w:shd w:val="clear" w:color="auto" w:fill="F3F5FC"/>
+          </w:tcPr>
+          <w:p>
+            <w:pPr>
+              <w:spacing w:before="0" w:after="0"/>
+            </w:pPr>
+          </w:p>
+        </w:tc>
+      </w:tr>
+      <w:tr>
+        <w:trPr>
+          <w:trHeight w:val="567" w:hRule="atLeast"/>
+          <w:cantSplit/>
+        </w:trPr>
+        <w:tc>
+          <w:tcPr>
+            <w:tcW w:type="dxa" w:w="7143"/>
+            <w:vAlign w:val="center"/>
+          </w:tcPr>
+          <w:p>
+            <w:pPr>
+              <w:spacing w:before="0" w:after="0"/>
+            </w:pPr>
+            <w:r/>
+            <w:r>
+              <w:rPr>
+                <w:b w:val="0"/>
+                <w:i w:val="0"/>
+              </w:rPr>
+              <w:t>d.  Je twee groepsgenoten moeten weten wat je vroeg.</w:t>
+            </w:r>
+          </w:p>
+        </w:tc>
+        <w:tc>
+          <w:tcPr>
+            <w:tcW w:type="dxa" w:w="2494"/>
+            <w:vAlign w:val="center"/>
+            <w:shd w:val="clear" w:color="auto" w:fill="F3F5FC"/>
+          </w:tcPr>
+          <w:p>
+            <w:pPr>
+              <w:spacing w:before="0" w:after="0"/>
+            </w:pPr>
+          </w:p>
+        </w:tc>
+      </w:tr>
+    </w:tbl>
+    <w:p>
+      <w:pPr>
+        <w:spacing w:before="0" w:after="0" w:line="80" w:lineRule="exact"/>
+        <w:rPr>
+          <w:sz w:val="4"/>
+        </w:rPr>
+      </w:pPr>
+    </w:p>
+    <w:p>
+      <w:pPr>
+        <w:keepNext/>
+        <w:spacing w:before="160" w:after="80"/>
+      </w:pPr>
+      <w:r>
+        <w:rPr>
+          <w:b/>
+        </w:rPr>
+        <w:t>Vraag 1. Waarom zet je de 24 leerlingen niet in Cc?</w:t>
+      </w:r>
+    </w:p>
+    <w:tbl>
+      <w:tblPr>
+        <w:tblW w:type="auto" w:w="0"/>
+        <w:jc w:val="center"/>
+        <w:tblLayout w:type="fixed"/>
+        <w:tblLook w:firstColumn="1" w:firstRow="1" w:lastColumn="0" w:lastRow="0" w:noHBand="0" w:noVBand="1" w:val="04A0"/>
+        <w:tblBorders>
+          <w:top w:val="single" w:sz="6" w:space="0" w:color="A7B1DE"/>
+          <w:left w:val="single" w:sz="6" w:space="0" w:color="A7B1DE"/>
+          <w:bottom w:val="single" w:sz="6" w:space="0" w:color="A7B1DE"/>
+          <w:right w:val="single" w:sz="6" w:space="0" w:color="A7B1DE"/>
+          <w:insideH w:val="nil"/>
+          <w:insideV w:val="nil"/>
+        </w:tblBorders>
+        <w:tblLayout w:type="fixed"/>
+      </w:tblPr>
+      <w:tblGrid>
+        <w:gridCol w:w="9638"/>
+      </w:tblGrid>
+      <w:tr>
+        <w:trPr>
+          <w:trHeight w:val="1020" w:hRule="atLeast"/>
+          <w:cantSplit/>
+        </w:trPr>
+        <w:tc>
+          <w:tcPr>
+            <w:tcW w:type="dxa" w:w="9638"/>
+            <w:shd w:val="clear" w:color="auto" w:fill="F3F5FC"/>
+          </w:tcPr>
+          <w:p>
+            <w:pPr>
+              <w:spacing w:before="0" w:after="0"/>
+            </w:pPr>
+          </w:p>
+        </w:tc>
+      </w:tr>
+    </w:tbl>
+    <w:p>
+      <w:pPr>
+        <w:spacing w:before="0" w:after="0" w:line="80" w:lineRule="exact"/>
+        <w:rPr>
+          <w:sz w:val="4"/>
+        </w:rPr>
+      </w:pPr>
+    </w:p>
+    <w:p>
+      <w:pPr>
+        <w:keepNext/>
+        <w:pageBreakBefore/>
+        <w:spacing w:before="0" w:after="160"/>
+        <w:pBdr>
+          <w:bottom w:val="single" w:sz="6" w:space="3" w:color="A7B1DE"/>
+        </w:pBdr>
+      </w:pPr>
+      <w:r>
+        <w:rPr>
+          <w:rFonts w:ascii="Montserrat" w:hAnsi="Montserrat" w:eastAsia="Montserrat"/>
+          <w:b/>
+          <w:i w:val="0"/>
+          <w:color w:val="2A3973"/>
+          <w:sz w:val="28"/>
+        </w:rPr>
+        <w:t>Deel 3 — Mijn interviewaanvraag</w:t>
+      </w:r>
+    </w:p>
+    <w:tbl>
+      <w:tblPr>
+        <w:tblW w:type="auto" w:w="0"/>
+        <w:jc w:val="center"/>
+        <w:tblLayout w:type="fixed"/>
+        <w:tblLook w:firstColumn="1" w:firstRow="1" w:lastColumn="0" w:lastRow="0" w:noHBand="0" w:noVBand="1" w:val="04A0"/>
+        <w:tblBorders>
+          <w:top w:val="single" w:sz="6" w:space="0" w:color="9AA0A6"/>
+          <w:left w:val="single" w:sz="6" w:space="0" w:color="9AA0A6"/>
+          <w:bottom w:val="single" w:sz="6" w:space="0" w:color="9AA0A6"/>
+          <w:right w:val="single" w:sz="6" w:space="0" w:color="9AA0A6"/>
+          <w:insideH w:val="nil"/>
+          <w:insideV w:val="nil"/>
+        </w:tblBorders>
+        <w:tblLayout w:type="fixed"/>
       </w:tblPr>
       <w:tblGrid>
         <w:gridCol w:w="1814"/>
         <w:gridCol w:w="7824"/>
       </w:tblGrid>
       <w:tr>
+        <w:trPr>
+          <w:trHeight w:val="453" w:hRule="atLeast"/>
+          <w:cantSplit/>
+        </w:trPr>
         <w:tc>
           <w:tcPr>
             <w:tcW w:type="dxa" w:w="9638"/>
             <w:gridSpan w:val="2"/>
-            <w:shd w:val="clear" w:fill="F2F6FC"/>
+            <w:shd w:val="clear" w:color="auto" w:fill="F2F6FC"/>
+            <w:vAlign w:val="center"/>
           </w:tcPr>
           <w:p>
+            <w:pPr>
+              <w:spacing w:before="0" w:after="0"/>
+            </w:pPr>
             <w:r/>
             <w:r>
               <w:rPr>
                 <w:b/>
+                <w:i w:val="0"/>
                 <w:color w:val="202124"/>
               </w:rPr>
               <w:t>Nieuw bericht</w:t>
@@ -1195,20 +1261,26 @@
       </w:tr>
       <w:tr>
         <w:trPr>
-          <w:trHeight w:val="453" w:hRule="atLeast"/>
+          <w:trHeight w:val="481" w:hRule="atLeast"/>
+          <w:cantSplit/>
         </w:trPr>
         <w:tc>
           <w:tcPr>
             <w:tcW w:type="dxa" w:w="1814"/>
+            <w:vAlign w:val="center"/>
             <w:tcBorders>
-              <w:bottom w:val="single" w:sz="6" w:color="DADCE0"/>
+              <w:bottom w:val="single" w:sz="6" w:space="0" w:color="DADCE0"/>
             </w:tcBorders>
           </w:tcPr>
           <w:p>
+            <w:pPr>
+              <w:spacing w:before="0" w:after="0"/>
+            </w:pPr>
             <w:r/>
             <w:r>
               <w:rPr>
                 <w:b w:val="0"/>
+                <w:i w:val="0"/>
                 <w:color w:val="5F6368"/>
               </w:rPr>
               <w:t>Aan</w:t>
@@ -1218,29 +1290,41 @@
         <w:tc>
           <w:tcPr>
             <w:tcW w:type="dxa" w:w="7824"/>
+            <w:shd w:val="clear" w:color="auto" w:fill="F3F5FC"/>
+            <w:vAlign w:val="center"/>
             <w:tcBorders>
-              <w:bottom w:val="single" w:sz="6" w:color="DADCE0"/>
+              <w:bottom w:val="single" w:sz="6" w:space="0" w:color="DADCE0"/>
             </w:tcBorders>
           </w:tcPr>
-          <w:p/>
+          <w:p>
+            <w:pPr>
+              <w:spacing w:before="0" w:after="0"/>
+            </w:pPr>
+          </w:p>
         </w:tc>
       </w:tr>
       <w:tr>
         <w:trPr>
-          <w:trHeight w:val="453" w:hRule="atLeast"/>
+          <w:trHeight w:val="481" w:hRule="atLeast"/>
+          <w:cantSplit/>
         </w:trPr>
         <w:tc>
           <w:tcPr>
             <w:tcW w:type="dxa" w:w="1814"/>
+            <w:vAlign w:val="center"/>
             <w:tcBorders>
-              <w:bottom w:val="single" w:sz="6" w:color="DADCE0"/>
+              <w:bottom w:val="single" w:sz="6" w:space="0" w:color="DADCE0"/>
             </w:tcBorders>
           </w:tcPr>
           <w:p>
+            <w:pPr>
+              <w:spacing w:before="0" w:after="0"/>
+            </w:pPr>
             <w:r/>
             <w:r>
               <w:rPr>
                 <w:b w:val="0"/>
+                <w:i w:val="0"/>
                 <w:color w:val="5F6368"/>
               </w:rPr>
               <w:t>Cc</w:t>
@@ -1250,29 +1334,41 @@
         <w:tc>
           <w:tcPr>
             <w:tcW w:type="dxa" w:w="7824"/>
+            <w:shd w:val="clear" w:color="auto" w:fill="F3F5FC"/>
+            <w:vAlign w:val="center"/>
             <w:tcBorders>
-              <w:bottom w:val="single" w:sz="6" w:color="DADCE0"/>
+              <w:bottom w:val="single" w:sz="6" w:space="0" w:color="DADCE0"/>
             </w:tcBorders>
           </w:tcPr>
-          <w:p/>
+          <w:p>
+            <w:pPr>
+              <w:spacing w:before="0" w:after="0"/>
+            </w:pPr>
+          </w:p>
         </w:tc>
       </w:tr>
       <w:tr>
         <w:trPr>
-          <w:trHeight w:val="453" w:hRule="atLeast"/>
+          <w:trHeight w:val="481" w:hRule="atLeast"/>
+          <w:cantSplit/>
         </w:trPr>
         <w:tc>
           <w:tcPr>
             <w:tcW w:type="dxa" w:w="1814"/>
+            <w:vAlign w:val="center"/>
             <w:tcBorders>
-              <w:bottom w:val="single" w:sz="6" w:color="DADCE0"/>
+              <w:bottom w:val="single" w:sz="6" w:space="0" w:color="DADCE0"/>
             </w:tcBorders>
           </w:tcPr>
           <w:p>
+            <w:pPr>
+              <w:spacing w:before="0" w:after="0"/>
+            </w:pPr>
             <w:r/>
             <w:r>
               <w:rPr>
                 <w:b w:val="0"/>
+                <w:i w:val="0"/>
                 <w:color w:val="5F6368"/>
               </w:rPr>
               <w:t>Bcc</w:t>
@@ -1282,29 +1378,41 @@
         <w:tc>
           <w:tcPr>
             <w:tcW w:type="dxa" w:w="7824"/>
+            <w:shd w:val="clear" w:color="auto" w:fill="F3F5FC"/>
+            <w:vAlign w:val="center"/>
             <w:tcBorders>
-              <w:bottom w:val="single" w:sz="6" w:color="DADCE0"/>
+              <w:bottom w:val="single" w:sz="6" w:space="0" w:color="DADCE0"/>
             </w:tcBorders>
           </w:tcPr>
-          <w:p/>
+          <w:p>
+            <w:pPr>
+              <w:spacing w:before="0" w:after="0"/>
+            </w:pPr>
+          </w:p>
         </w:tc>
       </w:tr>
       <w:tr>
         <w:trPr>
-          <w:trHeight w:val="453" w:hRule="atLeast"/>
+          <w:trHeight w:val="481" w:hRule="atLeast"/>
+          <w:cantSplit/>
         </w:trPr>
         <w:tc>
           <w:tcPr>
             <w:tcW w:type="dxa" w:w="1814"/>
+            <w:vAlign w:val="center"/>
             <w:tcBorders>
-              <w:bottom w:val="single" w:sz="6" w:color="DADCE0"/>
+              <w:bottom w:val="single" w:sz="6" w:space="0" w:color="DADCE0"/>
             </w:tcBorders>
           </w:tcPr>
           <w:p>
+            <w:pPr>
+              <w:spacing w:before="0" w:after="0"/>
+            </w:pPr>
             <w:r/>
             <w:r>
               <w:rPr>
                 <w:b w:val="0"/>
+                <w:i w:val="0"/>
                 <w:color w:val="5F6368"/>
               </w:rPr>
               <w:t>Onderwerp</w:t>
@@ -1314,28 +1422,39 @@
         <w:tc>
           <w:tcPr>
             <w:tcW w:type="dxa" w:w="7824"/>
+            <w:shd w:val="clear" w:color="auto" w:fill="F3F5FC"/>
+            <w:vAlign w:val="center"/>
             <w:tcBorders>
-              <w:bottom w:val="single" w:sz="6" w:color="DADCE0"/>
+              <w:bottom w:val="single" w:sz="6" w:space="0" w:color="DADCE0"/>
             </w:tcBorders>
           </w:tcPr>
-          <w:p/>
+          <w:p>
+            <w:pPr>
+              <w:spacing w:before="0" w:after="0"/>
+            </w:pPr>
+          </w:p>
         </w:tc>
       </w:tr>
       <w:tr>
         <w:trPr>
-          <w:trHeight w:val="510" w:hRule="atLeast"/>
+          <w:trHeight w:val="567" w:hRule="atLeast"/>
+          <w:cantSplit/>
         </w:trPr>
         <w:tc>
           <w:tcPr>
             <w:tcW w:type="dxa" w:w="1814"/>
           </w:tcPr>
           <w:p>
+            <w:pPr>
+              <w:spacing w:before="0" w:after="0"/>
+            </w:pPr>
             <w:r/>
             <w:r>
               <w:rPr>
                 <w:b w:val="0"/>
+                <w:i w:val="0"/>
                 <w:color w:val="5F6368"/>
-                <w:sz w:val="17"/>
+                <w:sz w:val="20"/>
               </w:rPr>
               <w:t>aanspreking</w:t>
             </w:r>
@@ -1344,25 +1463,35 @@
         <w:tc>
           <w:tcPr>
             <w:tcW w:type="dxa" w:w="7824"/>
+            <w:shd w:val="clear" w:color="auto" w:fill="F3F5FC"/>
           </w:tcPr>
-          <w:p/>
+          <w:p>
+            <w:pPr>
+              <w:spacing w:before="0" w:after="0"/>
+            </w:pPr>
+          </w:p>
         </w:tc>
       </w:tr>
       <w:tr>
         <w:trPr>
-          <w:trHeight w:val="1134" w:hRule="atLeast"/>
+          <w:trHeight w:val="1360" w:hRule="atLeast"/>
+          <w:cantSplit/>
         </w:trPr>
         <w:tc>
           <w:tcPr>
             <w:tcW w:type="dxa" w:w="1814"/>
           </w:tcPr>
           <w:p>
+            <w:pPr>
+              <w:spacing w:before="0" w:after="0"/>
+            </w:pPr>
             <w:r/>
             <w:r>
               <w:rPr>
                 <w:b w:val="0"/>
+                <w:i w:val="0"/>
                 <w:color w:val="5F6368"/>
-                <w:sz w:val="17"/>
+                <w:sz w:val="20"/>
               </w:rPr>
               <w:t>inleiding:</w:t>
               <w:br/>
@@ -1373,25 +1502,35 @@
         <w:tc>
           <w:tcPr>
             <w:tcW w:type="dxa" w:w="7824"/>
+            <w:shd w:val="clear" w:color="auto" w:fill="F3F5FC"/>
           </w:tcPr>
-          <w:p/>
+          <w:p>
+            <w:pPr>
+              <w:spacing w:before="0" w:after="0"/>
+            </w:pPr>
+          </w:p>
         </w:tc>
       </w:tr>
       <w:tr>
         <w:trPr>
-          <w:trHeight w:val="1701" w:hRule="atLeast"/>
+          <w:trHeight w:val="1927" w:hRule="atLeast"/>
+          <w:cantSplit/>
         </w:trPr>
         <w:tc>
           <w:tcPr>
             <w:tcW w:type="dxa" w:w="1814"/>
           </w:tcPr>
           <w:p>
+            <w:pPr>
+              <w:spacing w:before="0" w:after="0"/>
+            </w:pPr>
             <w:r/>
             <w:r>
               <w:rPr>
                 <w:b w:val="0"/>
+                <w:i w:val="0"/>
                 <w:color w:val="5F6368"/>
-                <w:sz w:val="17"/>
+                <w:sz w:val="20"/>
               </w:rPr>
               <w:t>midden:</w:t>
               <w:br/>
@@ -1402,25 +1541,35 @@
         <w:tc>
           <w:tcPr>
             <w:tcW w:type="dxa" w:w="7824"/>
+            <w:shd w:val="clear" w:color="auto" w:fill="F3F5FC"/>
           </w:tcPr>
-          <w:p/>
+          <w:p>
+            <w:pPr>
+              <w:spacing w:before="0" w:after="0"/>
+            </w:pPr>
+          </w:p>
         </w:tc>
       </w:tr>
       <w:tr>
         <w:trPr>
-          <w:trHeight w:val="907" w:hRule="atLeast"/>
+          <w:trHeight w:val="1020" w:hRule="atLeast"/>
+          <w:cantSplit/>
         </w:trPr>
         <w:tc>
           <w:tcPr>
             <w:tcW w:type="dxa" w:w="1814"/>
           </w:tcPr>
           <w:p>
+            <w:pPr>
+              <w:spacing w:before="0" w:after="0"/>
+            </w:pPr>
             <w:r/>
             <w:r>
               <w:rPr>
                 <w:b w:val="0"/>
+                <w:i w:val="0"/>
                 <w:color w:val="5F6368"/>
-                <w:sz w:val="17"/>
+                <w:sz w:val="20"/>
               </w:rPr>
               <w:t>slot:</w:t>
               <w:br/>
@@ -1431,25 +1580,35 @@
         <w:tc>
           <w:tcPr>
             <w:tcW w:type="dxa" w:w="7824"/>
+            <w:shd w:val="clear" w:color="auto" w:fill="F3F5FC"/>
           </w:tcPr>
-          <w:p/>
+          <w:p>
+            <w:pPr>
+              <w:spacing w:before="0" w:after="0"/>
+            </w:pPr>
+          </w:p>
         </w:tc>
       </w:tr>
       <w:tr>
         <w:trPr>
-          <w:trHeight w:val="510" w:hRule="atLeast"/>
+          <w:trHeight w:val="567" w:hRule="atLeast"/>
+          <w:cantSplit/>
         </w:trPr>
         <w:tc>
           <w:tcPr>
             <w:tcW w:type="dxa" w:w="1814"/>
           </w:tcPr>
           <w:p>
+            <w:pPr>
+              <w:spacing w:before="0" w:after="0"/>
+            </w:pPr>
             <w:r/>
             <w:r>
               <w:rPr>
                 <w:b w:val="0"/>
+                <w:i w:val="0"/>
                 <w:color w:val="5F6368"/>
-                <w:sz w:val="17"/>
+                <w:sz w:val="20"/>
               </w:rPr>
               <w:t>slotgroet</w:t>
             </w:r>
@@ -1458,25 +1617,35 @@
         <w:tc>
           <w:tcPr>
             <w:tcW w:type="dxa" w:w="7824"/>
+            <w:shd w:val="clear" w:color="auto" w:fill="F3F5FC"/>
           </w:tcPr>
-          <w:p/>
+          <w:p>
+            <w:pPr>
+              <w:spacing w:before="0" w:after="0"/>
+            </w:pPr>
+          </w:p>
         </w:tc>
       </w:tr>
       <w:tr>
         <w:trPr>
           <w:trHeight w:val="1360" w:hRule="atLeast"/>
+          <w:cantSplit/>
         </w:trPr>
         <w:tc>
           <w:tcPr>
             <w:tcW w:type="dxa" w:w="1814"/>
           </w:tcPr>
           <w:p>
+            <w:pPr>
+              <w:spacing w:before="0" w:after="0"/>
+            </w:pPr>
             <w:r/>
             <w:r>
               <w:rPr>
                 <w:b w:val="0"/>
+                <w:i w:val="0"/>
                 <w:color w:val="5F6368"/>
-                <w:sz w:val="17"/>
+                <w:sz w:val="20"/>
               </w:rPr>
               <w:t>handtekening:</w:t>
               <w:br/>
@@ -1487,260 +1656,957 @@
         <w:tc>
           <w:tcPr>
             <w:tcW w:type="dxa" w:w="7824"/>
-          </w:tcPr>
-          <w:p/>
-        </w:tc>
-      </w:tr>
-      <w:tr>
-        <w:tc>
-          <w:tcPr>
-            <w:tcW w:type="dxa" w:w="1814"/>
-            <w:shd w:val="clear" w:fill="0B57D0"/>
+            <w:shd w:val="clear" w:color="auto" w:fill="F3F5FC"/>
           </w:tcPr>
           <w:p>
             <w:pPr>
+              <w:spacing w:before="0" w:after="0"/>
+            </w:pPr>
+          </w:p>
+        </w:tc>
+      </w:tr>
+    </w:tbl>
+    <w:p>
+      <w:pPr>
+        <w:keepNext/>
+        <w:pageBreakBefore/>
+        <w:spacing w:before="0" w:after="160"/>
+        <w:pBdr>
+          <w:bottom w:val="single" w:sz="6" w:space="3" w:color="A7B1DE"/>
+        </w:pBdr>
+      </w:pPr>
+      <w:r>
+        <w:rPr>
+          <w:rFonts w:ascii="Montserrat" w:hAnsi="Montserrat" w:eastAsia="Montserrat"/>
+          <w:b/>
+          <w:i w:val="0"/>
+          <w:color w:val="2A3973"/>
+          <w:sz w:val="28"/>
+        </w:rPr>
+        <w:t>Deel 4 — Feedback van je buur</w:t>
+      </w:r>
+    </w:p>
+    <w:tbl>
+      <w:tblPr>
+        <w:tblW w:type="auto" w:w="0"/>
+        <w:jc w:val="center"/>
+        <w:tblLayout w:type="fixed"/>
+        <w:tblLook w:firstColumn="1" w:firstRow="1" w:lastColumn="0" w:lastRow="0" w:noHBand="0" w:noVBand="1" w:val="04A0"/>
+        <w:tblBorders>
+          <w:top w:val="single" w:sz="6" w:space="0" w:color="A7B1DE"/>
+          <w:left w:val="single" w:sz="6" w:space="0" w:color="A7B1DE"/>
+          <w:bottom w:val="single" w:sz="6" w:space="0" w:color="A7B1DE"/>
+          <w:right w:val="single" w:sz="6" w:space="0" w:color="A7B1DE"/>
+          <w:insideH w:val="single" w:sz="6" w:space="0" w:color="D5DAEE"/>
+          <w:insideV w:val="single" w:sz="6" w:space="0" w:color="D5DAEE"/>
+        </w:tblBorders>
+        <w:tblLayout w:type="fixed"/>
+      </w:tblPr>
+      <w:tblGrid>
+        <w:gridCol w:w="907"/>
+        <w:gridCol w:w="7597"/>
+        <w:gridCol w:w="1134"/>
+      </w:tblGrid>
+      <w:tr>
+        <w:trPr>
+          <w:cantSplit/>
+        </w:trPr>
+        <w:tc>
+          <w:tcPr>
+            <w:tcW w:type="dxa" w:w="907"/>
+            <w:shd w:val="clear" w:color="auto" w:fill="E4E8F6"/>
+          </w:tcPr>
+          <w:p>
+            <w:pPr>
+              <w:spacing w:before="0" w:after="0"/>
               <w:jc w:val="center"/>
             </w:pPr>
             <w:r/>
             <w:r>
               <w:rPr>
                 <w:b/>
-                <w:color w:val="FFFFFF"/>
+                <w:i w:val="0"/>
+                <w:color w:val="2A3973"/>
+                <w:sz w:val="22"/>
               </w:rPr>
-              <w:t>Verzenden</w:t>
+              <w:t>Klopt?</w:t>
             </w:r>
           </w:p>
         </w:tc>
         <w:tc>
           <w:tcPr>
-            <w:tcW w:type="dxa" w:w="7824"/>
+            <w:tcW w:type="dxa" w:w="7597"/>
+            <w:shd w:val="clear" w:color="auto" w:fill="E4E8F6"/>
           </w:tcPr>
           <w:p>
+            <w:pPr>
+              <w:spacing w:before="0" w:after="0"/>
+            </w:pPr>
+            <w:r/>
+            <w:r>
+              <w:rPr>
+                <w:b/>
+                <w:i w:val="0"/>
+                <w:color w:val="2A3973"/>
+                <w:sz w:val="22"/>
+              </w:rPr>
+              <w:t>Wat moet kloppen?</w:t>
+            </w:r>
+          </w:p>
+        </w:tc>
+        <w:tc>
+          <w:tcPr>
+            <w:tcW w:type="dxa" w:w="1134"/>
+            <w:shd w:val="clear" w:color="auto" w:fill="E4E8F6"/>
+          </w:tcPr>
+          <w:p>
+            <w:pPr>
+              <w:spacing w:before="0" w:after="0"/>
+              <w:jc w:val="center"/>
+            </w:pPr>
+            <w:r/>
+            <w:r>
+              <w:rPr>
+                <w:b/>
+                <w:i w:val="0"/>
+                <w:color w:val="2A3973"/>
+                <w:sz w:val="22"/>
+              </w:rPr>
+              <w:t>Punten</w:t>
+            </w:r>
+          </w:p>
+        </w:tc>
+      </w:tr>
+      <w:tr>
+        <w:trPr>
+          <w:trHeight w:val="510" w:hRule="atLeast"/>
+          <w:cantSplit/>
+        </w:trPr>
+        <w:tc>
+          <w:tcPr>
+            <w:tcW w:type="dxa" w:w="907"/>
+            <w:shd w:val="clear" w:color="auto" w:fill="F3F5FC"/>
+            <w:vAlign w:val="center"/>
+          </w:tcPr>
+          <w:p>
+            <w:pPr>
+              <w:spacing w:before="0" w:after="0"/>
+              <w:jc w:val="center"/>
+            </w:pPr>
+          </w:p>
+        </w:tc>
+        <w:tc>
+          <w:tcPr>
+            <w:tcW w:type="dxa" w:w="7597"/>
+            <w:vAlign w:val="center"/>
+          </w:tcPr>
+          <w:p>
+            <w:pPr>
+              <w:spacing w:before="0" w:after="0"/>
+            </w:pPr>
             <w:r/>
             <w:r>
               <w:rPr>
                 <w:b w:val="0"/>
+                <w:i w:val="0"/>
+              </w:rPr>
+              <w:t>Bij Aan staat de jongerenwerker, bij Cc de begeleider. Bcc is leeg.</w:t>
+            </w:r>
+          </w:p>
+        </w:tc>
+        <w:tc>
+          <w:tcPr>
+            <w:tcW w:type="dxa" w:w="1134"/>
+            <w:vAlign w:val="center"/>
+          </w:tcPr>
+          <w:p>
+            <w:pPr>
+              <w:jc w:val="right"/>
+            </w:pPr>
+            <w:r>
+              <w:rPr>
+                <w:rFonts w:ascii="Calibri" w:hAnsi="Calibri" w:eastAsia="Calibri"/>
+                <w:b w:val="0"/>
+                <w:i w:val="0"/>
                 <w:color w:val="5F6368"/>
-                <w:sz w:val="18"/>
+                <w:sz w:val="24"/>
               </w:rPr>
-              <w:t>Niet echt: je levert dit document in, in Classroom.</w:t>
+              <w:t>/ 3</w:t>
+            </w:r>
+          </w:p>
+        </w:tc>
+      </w:tr>
+      <w:tr>
+        <w:trPr>
+          <w:trHeight w:val="510" w:hRule="atLeast"/>
+          <w:cantSplit/>
+        </w:trPr>
+        <w:tc>
+          <w:tcPr>
+            <w:tcW w:type="dxa" w:w="907"/>
+            <w:shd w:val="clear" w:color="auto" w:fill="F3F5FC"/>
+            <w:vAlign w:val="center"/>
+          </w:tcPr>
+          <w:p>
+            <w:pPr>
+              <w:spacing w:before="0" w:after="0"/>
+              <w:jc w:val="center"/>
+            </w:pPr>
+          </w:p>
+        </w:tc>
+        <w:tc>
+          <w:tcPr>
+            <w:tcW w:type="dxa" w:w="7597"/>
+            <w:vAlign w:val="center"/>
+          </w:tcPr>
+          <w:p>
+            <w:pPr>
+              <w:spacing w:before="0" w:after="0"/>
+            </w:pPr>
+            <w:r/>
+            <w:r>
+              <w:rPr>
+                <w:b w:val="0"/>
+                <w:i w:val="0"/>
+              </w:rPr>
+              <w:t>Het onderwerp zegt waarover de e-mail gaat en van wie hij komt.</w:t>
+            </w:r>
+          </w:p>
+        </w:tc>
+        <w:tc>
+          <w:tcPr>
+            <w:tcW w:type="dxa" w:w="1134"/>
+            <w:vAlign w:val="center"/>
+          </w:tcPr>
+          <w:p>
+            <w:pPr>
+              <w:jc w:val="right"/>
+            </w:pPr>
+            <w:r>
+              <w:rPr>
+                <w:rFonts w:ascii="Calibri" w:hAnsi="Calibri" w:eastAsia="Calibri"/>
+                <w:b w:val="0"/>
+                <w:i w:val="0"/>
+                <w:color w:val="5F6368"/>
+                <w:sz w:val="24"/>
+              </w:rPr>
+              <w:t>/ 2</w:t>
+            </w:r>
+          </w:p>
+        </w:tc>
+      </w:tr>
+      <w:tr>
+        <w:trPr>
+          <w:trHeight w:val="510" w:hRule="atLeast"/>
+          <w:cantSplit/>
+        </w:trPr>
+        <w:tc>
+          <w:tcPr>
+            <w:tcW w:type="dxa" w:w="907"/>
+            <w:shd w:val="clear" w:color="auto" w:fill="F3F5FC"/>
+            <w:vAlign w:val="center"/>
+          </w:tcPr>
+          <w:p>
+            <w:pPr>
+              <w:spacing w:before="0" w:after="0"/>
+              <w:jc w:val="center"/>
+            </w:pPr>
+          </w:p>
+        </w:tc>
+        <w:tc>
+          <w:tcPr>
+            <w:tcW w:type="dxa" w:w="7597"/>
+            <w:vAlign w:val="center"/>
+          </w:tcPr>
+          <w:p>
+            <w:pPr>
+              <w:spacing w:before="0" w:after="0"/>
+            </w:pPr>
+            <w:r/>
+            <w:r>
+              <w:rPr>
+                <w:b w:val="0"/>
+                <w:i w:val="0"/>
+              </w:rPr>
+              <w:t xml:space="preserve">De aanspreking is </w:t>
+            </w:r>
+            <w:r>
+              <w:rPr>
+                <w:b w:val="0"/>
+                <w:i/>
+              </w:rPr>
+              <w:t>Beste mevrouw De Clercq,</w:t>
+            </w:r>
+            <w:r>
+              <w:rPr>
+                <w:b w:val="0"/>
+                <w:i w:val="0"/>
+              </w:rPr>
+              <w:t xml:space="preserve"> (of </w:t>
+            </w:r>
+            <w:r>
+              <w:rPr>
+                <w:b w:val="0"/>
+                <w:i/>
+              </w:rPr>
+              <w:t>Geachte</w:t>
+            </w:r>
+            <w:r>
+              <w:rPr>
+                <w:b w:val="0"/>
+                <w:i w:val="0"/>
+              </w:rPr>
+              <w:t xml:space="preserve">), met een komma. De slotgroet is </w:t>
+            </w:r>
+            <w:r>
+              <w:rPr>
+                <w:b w:val="0"/>
+                <w:i/>
+              </w:rPr>
+              <w:t>Met vriendelijke groeten,</w:t>
+            </w:r>
+            <w:r>
+              <w:rPr>
+                <w:b w:val="0"/>
+                <w:i w:val="0"/>
+              </w:rPr>
+              <w:t xml:space="preserve"> met daaronder naam, klas, Onderzoekslabo en school.</w:t>
+            </w:r>
+          </w:p>
+        </w:tc>
+        <w:tc>
+          <w:tcPr>
+            <w:tcW w:type="dxa" w:w="1134"/>
+            <w:vAlign w:val="center"/>
+          </w:tcPr>
+          <w:p>
+            <w:pPr>
+              <w:jc w:val="right"/>
+            </w:pPr>
+            <w:r>
+              <w:rPr>
+                <w:rFonts w:ascii="Calibri" w:hAnsi="Calibri" w:eastAsia="Calibri"/>
+                <w:b w:val="0"/>
+                <w:i w:val="0"/>
+                <w:color w:val="5F6368"/>
+                <w:sz w:val="24"/>
+              </w:rPr>
+              <w:t>/ 3</w:t>
+            </w:r>
+          </w:p>
+        </w:tc>
+      </w:tr>
+      <w:tr>
+        <w:trPr>
+          <w:trHeight w:val="510" w:hRule="atLeast"/>
+          <w:cantSplit/>
+        </w:trPr>
+        <w:tc>
+          <w:tcPr>
+            <w:tcW w:type="dxa" w:w="907"/>
+            <w:shd w:val="clear" w:color="auto" w:fill="F3F5FC"/>
+            <w:vAlign w:val="center"/>
+          </w:tcPr>
+          <w:p>
+            <w:pPr>
+              <w:spacing w:before="0" w:after="0"/>
+              <w:jc w:val="center"/>
+            </w:pPr>
+          </w:p>
+        </w:tc>
+        <w:tc>
+          <w:tcPr>
+            <w:tcW w:type="dxa" w:w="7597"/>
+            <w:vAlign w:val="center"/>
+          </w:tcPr>
+          <w:p>
+            <w:pPr>
+              <w:spacing w:before="0" w:after="0"/>
+            </w:pPr>
+            <w:r/>
+            <w:r>
+              <w:rPr>
+                <w:b w:val="0"/>
+                <w:i w:val="0"/>
+              </w:rPr>
+              <w:t>In de inleiding staat wie ze is, namens wie ze mailt en waarom.</w:t>
+            </w:r>
+          </w:p>
+        </w:tc>
+        <w:tc>
+          <w:tcPr>
+            <w:tcW w:type="dxa" w:w="1134"/>
+            <w:vAlign w:val="center"/>
+          </w:tcPr>
+          <w:p>
+            <w:pPr>
+              <w:jc w:val="right"/>
+            </w:pPr>
+            <w:r>
+              <w:rPr>
+                <w:rFonts w:ascii="Calibri" w:hAnsi="Calibri" w:eastAsia="Calibri"/>
+                <w:b w:val="0"/>
+                <w:i w:val="0"/>
+                <w:color w:val="5F6368"/>
+                <w:sz w:val="24"/>
+              </w:rPr>
+              <w:t>/ 3</w:t>
+            </w:r>
+          </w:p>
+        </w:tc>
+      </w:tr>
+      <w:tr>
+        <w:trPr>
+          <w:trHeight w:val="510" w:hRule="atLeast"/>
+          <w:cantSplit/>
+        </w:trPr>
+        <w:tc>
+          <w:tcPr>
+            <w:tcW w:type="dxa" w:w="907"/>
+            <w:shd w:val="clear" w:color="auto" w:fill="F3F5FC"/>
+            <w:vAlign w:val="center"/>
+          </w:tcPr>
+          <w:p>
+            <w:pPr>
+              <w:spacing w:before="0" w:after="0"/>
+              <w:jc w:val="center"/>
+            </w:pPr>
+          </w:p>
+        </w:tc>
+        <w:tc>
+          <w:tcPr>
+            <w:tcW w:type="dxa" w:w="7597"/>
+            <w:vAlign w:val="center"/>
+          </w:tcPr>
+          <w:p>
+            <w:pPr>
+              <w:spacing w:before="0" w:after="0"/>
+            </w:pPr>
+            <w:r/>
+            <w:r>
+              <w:rPr>
+                <w:b w:val="0"/>
+                <w:i w:val="0"/>
+              </w:rPr>
+              <w:t>In het midden staat wat ze vraagt: hoe lang, wanneer, waar, en wat er met de antwoorden gebeurt.</w:t>
+            </w:r>
+          </w:p>
+        </w:tc>
+        <w:tc>
+          <w:tcPr>
+            <w:tcW w:type="dxa" w:w="1134"/>
+            <w:vAlign w:val="center"/>
+          </w:tcPr>
+          <w:p>
+            <w:pPr>
+              <w:jc w:val="right"/>
+            </w:pPr>
+            <w:r>
+              <w:rPr>
+                <w:rFonts w:ascii="Calibri" w:hAnsi="Calibri" w:eastAsia="Calibri"/>
+                <w:b w:val="0"/>
+                <w:i w:val="0"/>
+                <w:color w:val="5F6368"/>
+                <w:sz w:val="24"/>
+              </w:rPr>
+              <w:t>/ 4</w:t>
+            </w:r>
+          </w:p>
+        </w:tc>
+      </w:tr>
+      <w:tr>
+        <w:trPr>
+          <w:trHeight w:val="510" w:hRule="atLeast"/>
+          <w:cantSplit/>
+        </w:trPr>
+        <w:tc>
+          <w:tcPr>
+            <w:tcW w:type="dxa" w:w="907"/>
+            <w:shd w:val="clear" w:color="auto" w:fill="F3F5FC"/>
+            <w:vAlign w:val="center"/>
+          </w:tcPr>
+          <w:p>
+            <w:pPr>
+              <w:spacing w:before="0" w:after="0"/>
+              <w:jc w:val="center"/>
+            </w:pPr>
+          </w:p>
+        </w:tc>
+        <w:tc>
+          <w:tcPr>
+            <w:tcW w:type="dxa" w:w="7597"/>
+            <w:vAlign w:val="center"/>
+          </w:tcPr>
+          <w:p>
+            <w:pPr>
+              <w:spacing w:before="0" w:after="0"/>
+            </w:pPr>
+            <w:r/>
+            <w:r>
+              <w:rPr>
+                <w:b w:val="0"/>
+                <w:i w:val="0"/>
+              </w:rPr>
+              <w:t>In het slot staat tegen wanneer ze een antwoord hoopt, en ze bedankt.</w:t>
+            </w:r>
+          </w:p>
+        </w:tc>
+        <w:tc>
+          <w:tcPr>
+            <w:tcW w:type="dxa" w:w="1134"/>
+            <w:vAlign w:val="center"/>
+          </w:tcPr>
+          <w:p>
+            <w:pPr>
+              <w:jc w:val="right"/>
+            </w:pPr>
+            <w:r>
+              <w:rPr>
+                <w:rFonts w:ascii="Calibri" w:hAnsi="Calibri" w:eastAsia="Calibri"/>
+                <w:b w:val="0"/>
+                <w:i w:val="0"/>
+                <w:color w:val="5F6368"/>
+                <w:sz w:val="24"/>
+              </w:rPr>
+              <w:t>/ 2</w:t>
+            </w:r>
+          </w:p>
+        </w:tc>
+      </w:tr>
+      <w:tr>
+        <w:trPr>
+          <w:trHeight w:val="510" w:hRule="atLeast"/>
+          <w:cantSplit/>
+        </w:trPr>
+        <w:tc>
+          <w:tcPr>
+            <w:tcW w:type="dxa" w:w="907"/>
+            <w:shd w:val="clear" w:color="auto" w:fill="F3F5FC"/>
+            <w:vAlign w:val="center"/>
+          </w:tcPr>
+          <w:p>
+            <w:pPr>
+              <w:spacing w:before="0" w:after="0"/>
+              <w:jc w:val="center"/>
+            </w:pPr>
+          </w:p>
+        </w:tc>
+        <w:tc>
+          <w:tcPr>
+            <w:tcW w:type="dxa" w:w="7597"/>
+            <w:vAlign w:val="center"/>
+          </w:tcPr>
+          <w:p>
+            <w:pPr>
+              <w:spacing w:before="0" w:after="0"/>
+            </w:pPr>
+            <w:r/>
+            <w:r>
+              <w:rPr>
+                <w:b w:val="0"/>
+                <w:i w:val="0"/>
+              </w:rPr>
+              <w:t xml:space="preserve">Overal staat </w:t>
+            </w:r>
+            <w:r>
+              <w:rPr>
+                <w:b w:val="0"/>
+                <w:i/>
+              </w:rPr>
+              <w:t>u</w:t>
+            </w:r>
+            <w:r>
+              <w:rPr>
+                <w:b w:val="0"/>
+                <w:i w:val="0"/>
+              </w:rPr>
+              <w:t xml:space="preserve"> en </w:t>
+            </w:r>
+            <w:r>
+              <w:rPr>
+                <w:b w:val="0"/>
+                <w:i/>
+              </w:rPr>
+              <w:t>uw</w:t>
+            </w:r>
+            <w:r>
+              <w:rPr>
+                <w:b w:val="0"/>
+                <w:i w:val="0"/>
+              </w:rPr>
+              <w:t xml:space="preserve">, nergens </w:t>
+            </w:r>
+            <w:r>
+              <w:rPr>
+                <w:b w:val="0"/>
+                <w:i/>
+              </w:rPr>
+              <w:t>je</w:t>
+            </w:r>
+            <w:r>
+              <w:rPr>
+                <w:b w:val="0"/>
+                <w:i w:val="0"/>
+              </w:rPr>
+              <w:t xml:space="preserve"> of </w:t>
+            </w:r>
+            <w:r>
+              <w:rPr>
+                <w:b w:val="0"/>
+                <w:i/>
+              </w:rPr>
+              <w:t>jij</w:t>
+            </w:r>
+            <w:r>
+              <w:rPr>
+                <w:b w:val="0"/>
+                <w:i w:val="0"/>
+              </w:rPr>
+              <w:t>. Geen emoji's of chattaal. Korte alinea's.</w:t>
+            </w:r>
+          </w:p>
+        </w:tc>
+        <w:tc>
+          <w:tcPr>
+            <w:tcW w:type="dxa" w:w="1134"/>
+            <w:vAlign w:val="center"/>
+          </w:tcPr>
+          <w:p>
+            <w:pPr>
+              <w:jc w:val="right"/>
+            </w:pPr>
+            <w:r>
+              <w:rPr>
+                <w:rFonts w:ascii="Calibri" w:hAnsi="Calibri" w:eastAsia="Calibri"/>
+                <w:b w:val="0"/>
+                <w:i w:val="0"/>
+                <w:color w:val="5F6368"/>
+                <w:sz w:val="24"/>
+              </w:rPr>
+              <w:t>/ 2</w:t>
+            </w:r>
+          </w:p>
+        </w:tc>
+      </w:tr>
+      <w:tr>
+        <w:trPr>
+          <w:trHeight w:val="510" w:hRule="atLeast"/>
+          <w:cantSplit/>
+        </w:trPr>
+        <w:tc>
+          <w:tcPr>
+            <w:tcW w:type="dxa" w:w="907"/>
+            <w:shd w:val="clear" w:color="auto" w:fill="F3F5FC"/>
+            <w:vAlign w:val="center"/>
+          </w:tcPr>
+          <w:p>
+            <w:pPr>
+              <w:spacing w:before="0" w:after="0"/>
+              <w:jc w:val="center"/>
+            </w:pPr>
+          </w:p>
+        </w:tc>
+        <w:tc>
+          <w:tcPr>
+            <w:tcW w:type="dxa" w:w="7597"/>
+            <w:vAlign w:val="center"/>
+          </w:tcPr>
+          <w:p>
+            <w:pPr>
+              <w:spacing w:before="0" w:after="0"/>
+            </w:pPr>
+            <w:r/>
+            <w:r>
+              <w:rPr>
+                <w:b w:val="0"/>
+                <w:i w:val="0"/>
+              </w:rPr>
+              <w:t>Deel 1 en 2 zijn ingevuld.</w:t>
+            </w:r>
+          </w:p>
+        </w:tc>
+        <w:tc>
+          <w:tcPr>
+            <w:tcW w:type="dxa" w:w="1134"/>
+            <w:vAlign w:val="center"/>
+          </w:tcPr>
+          <w:p>
+            <w:pPr>
+              <w:jc w:val="right"/>
+            </w:pPr>
+            <w:r>
+              <w:rPr>
+                <w:rFonts w:ascii="Calibri" w:hAnsi="Calibri" w:eastAsia="Calibri"/>
+                <w:b w:val="0"/>
+                <w:i w:val="0"/>
+                <w:color w:val="5F6368"/>
+                <w:sz w:val="24"/>
+              </w:rPr>
+              <w:t>/ 1</w:t>
             </w:r>
           </w:p>
         </w:tc>
       </w:tr>
     </w:tbl>
-    <w:p/>
+    <w:p>
+      <w:pPr>
+        <w:spacing w:before="0" w:after="0" w:line="80" w:lineRule="exact"/>
+        <w:rPr>
+          <w:sz w:val="4"/>
+        </w:rPr>
+      </w:pPr>
+    </w:p>
     <w:p>
       <w:pPr>
         <w:keepNext/>
-        <w:spacing w:before="280" w:after="80"/>
+        <w:spacing w:before="160" w:after="80"/>
       </w:pPr>
       <w:r>
         <w:rPr>
           <w:b/>
-          <w:color w:val="2A3973"/>
-          <w:sz w:val="32"/>
         </w:rPr>
-        <w:t>Deel 4 — Feedback van je buur</w:t>
+        <w:t>Dit is goed (een top van je buur):</w:t>
       </w:r>
+    </w:p>
+    <w:tbl>
+      <w:tblPr>
+        <w:tblW w:type="auto" w:w="0"/>
+        <w:jc w:val="center"/>
+        <w:tblLayout w:type="fixed"/>
+        <w:tblLook w:firstColumn="1" w:firstRow="1" w:lastColumn="0" w:lastRow="0" w:noHBand="0" w:noVBand="1" w:val="04A0"/>
+        <w:tblBorders>
+          <w:top w:val="single" w:sz="6" w:space="0" w:color="A7B1DE"/>
+          <w:left w:val="single" w:sz="6" w:space="0" w:color="A7B1DE"/>
+          <w:bottom w:val="single" w:sz="6" w:space="0" w:color="A7B1DE"/>
+          <w:right w:val="single" w:sz="6" w:space="0" w:color="A7B1DE"/>
+          <w:insideH w:val="nil"/>
+          <w:insideV w:val="nil"/>
+        </w:tblBorders>
+        <w:tblLayout w:type="fixed"/>
+      </w:tblPr>
+      <w:tblGrid>
+        <w:gridCol w:w="9638"/>
+      </w:tblGrid>
+      <w:tr>
+        <w:trPr>
+          <w:trHeight w:val="680" w:hRule="atLeast"/>
+          <w:cantSplit/>
+        </w:trPr>
+        <w:tc>
+          <w:tcPr>
+            <w:tcW w:type="dxa" w:w="9638"/>
+            <w:shd w:val="clear" w:color="auto" w:fill="F3F5FC"/>
+          </w:tcPr>
+          <w:p>
+            <w:pPr>
+              <w:spacing w:before="0" w:after="0"/>
+            </w:pPr>
+          </w:p>
+        </w:tc>
+      </w:tr>
+    </w:tbl>
+    <w:p>
+      <w:pPr>
+        <w:spacing w:before="0" w:after="0" w:line="80" w:lineRule="exact"/>
+        <w:rPr>
+          <w:sz w:val="4"/>
+        </w:rPr>
+      </w:pPr>
     </w:p>
     <w:p>
       <w:pPr>
-        <w:spacing w:after="120"/>
-      </w:pPr>
-      <w:r>
-        <w:rPr>
-          <w:b w:val="0"/>
-          <w:i w:val="0"/>
-          <w:color w:val="5F6368"/>
-          <w:sz w:val="19"/>
-        </w:rPr>
-        <w:t>Je buur leest je e-mail op jouw scherm en kruist aan wat klopt. Klopt iets nog niet? Pas je e-mail aan.</w:t>
-      </w:r>
-    </w:p>
-    <w:p>
-      <w:pPr>
-        <w:spacing w:after="40"/>
-      </w:pPr>
-      <w:r>
-        <w:t>☐  Bij Aan staat de jongerenwerker, bij Cc de begeleider. Bcc is leeg.</w:t>
-      </w:r>
-    </w:p>
-    <w:p>
-      <w:pPr>
-        <w:spacing w:after="40"/>
-      </w:pPr>
-      <w:r>
-        <w:t>☐  Het onderwerp zegt waarover de e-mail gaat en van wie hij komt.</w:t>
-      </w:r>
-    </w:p>
-    <w:p>
-      <w:pPr>
-        <w:spacing w:after="40"/>
-      </w:pPr>
-      <w:r>
-        <w:t>☐  De aanspreking is Beste mevrouw De Clercq, (of Geachte), met een komma.</w:t>
-      </w:r>
-    </w:p>
-    <w:p>
-      <w:pPr>
-        <w:spacing w:after="40"/>
-      </w:pPr>
-      <w:r>
-        <w:t>☐  Overal staat u en uw, nergens je of jij.</w:t>
-      </w:r>
-    </w:p>
-    <w:p>
-      <w:pPr>
-        <w:spacing w:after="40"/>
-      </w:pPr>
-      <w:r>
-        <w:t>☐  In de inleiding staat wie ze is, namens wie ze mailt en waarom.</w:t>
-      </w:r>
-    </w:p>
-    <w:p>
-      <w:pPr>
-        <w:spacing w:after="40"/>
-      </w:pPr>
-      <w:r>
-        <w:t>☐  In het midden staat wat ze vraagt: hoe lang, wanneer, waar, en wat er met de antwoorden gebeurt.</w:t>
-      </w:r>
-    </w:p>
-    <w:p>
-      <w:pPr>
-        <w:spacing w:after="40"/>
-      </w:pPr>
-      <w:r>
-        <w:t>☐  In het slot staat tegen wanneer ze een antwoord hoopt, en ze bedankt.</w:t>
-      </w:r>
-    </w:p>
-    <w:p>
-      <w:pPr>
-        <w:spacing w:after="40"/>
-      </w:pPr>
-      <w:r>
-        <w:t>☐  De slotgroet is Met vriendelijke groeten, met daaronder naam, klas, Onderzoekslabo en school. Geen emoji's of chattaal.</w:t>
-      </w:r>
-    </w:p>
-    <w:p/>
-    <w:p>
-      <w:pPr>
-        <w:spacing w:after="120"/>
+        <w:keepNext/>
+        <w:spacing w:before="160" w:after="80"/>
       </w:pPr>
       <w:r>
         <w:rPr>
           <w:b/>
-          <w:i w:val="0"/>
         </w:rPr>
-        <w:t>Dit is goed (een top van je buur):</w:t>
+        <w:t>Dit kan beter (een tip van je buur):</w:t>
       </w:r>
+    </w:p>
+    <w:tbl>
+      <w:tblPr>
+        <w:tblW w:type="auto" w:w="0"/>
+        <w:jc w:val="center"/>
+        <w:tblLayout w:type="fixed"/>
+        <w:tblLook w:firstColumn="1" w:firstRow="1" w:lastColumn="0" w:lastRow="0" w:noHBand="0" w:noVBand="1" w:val="04A0"/>
+        <w:tblBorders>
+          <w:top w:val="single" w:sz="6" w:space="0" w:color="A7B1DE"/>
+          <w:left w:val="single" w:sz="6" w:space="0" w:color="A7B1DE"/>
+          <w:bottom w:val="single" w:sz="6" w:space="0" w:color="A7B1DE"/>
+          <w:right w:val="single" w:sz="6" w:space="0" w:color="A7B1DE"/>
+          <w:insideH w:val="nil"/>
+          <w:insideV w:val="nil"/>
+        </w:tblBorders>
+        <w:tblLayout w:type="fixed"/>
+      </w:tblPr>
+      <w:tblGrid>
+        <w:gridCol w:w="9638"/>
+      </w:tblGrid>
+      <w:tr>
+        <w:trPr>
+          <w:trHeight w:val="680" w:hRule="atLeast"/>
+          <w:cantSplit/>
+        </w:trPr>
+        <w:tc>
+          <w:tcPr>
+            <w:tcW w:type="dxa" w:w="9638"/>
+            <w:shd w:val="clear" w:color="auto" w:fill="F3F5FC"/>
+          </w:tcPr>
+          <w:p>
+            <w:pPr>
+              <w:spacing w:before="0" w:after="0"/>
+            </w:pPr>
+          </w:p>
+        </w:tc>
+      </w:tr>
+    </w:tbl>
+    <w:p>
+      <w:pPr>
+        <w:spacing w:before="0" w:after="0" w:line="80" w:lineRule="exact"/>
+        <w:rPr>
+          <w:sz w:val="4"/>
+        </w:rPr>
+      </w:pPr>
     </w:p>
     <w:p>
       <w:pPr>
-        <w:spacing w:after="40"/>
-      </w:pPr>
-      <w:r>
-        <w:t>______________________________________________________________________</w:t>
-      </w:r>
-    </w:p>
-    <w:p>
-      <w:pPr>
-        <w:spacing w:after="120"/>
+        <w:keepNext/>
+        <w:spacing w:before="160" w:after="80"/>
       </w:pPr>
       <w:r>
         <w:rPr>
           <w:b/>
-          <w:i w:val="0"/>
-        </w:rPr>
-        <w:t>Dit kan beter (een tip van je buur):</w:t>
-      </w:r>
-    </w:p>
-    <w:p>
-      <w:pPr>
-        <w:spacing w:after="40"/>
-      </w:pPr>
-      <w:r>
-        <w:t>______________________________________________________________________</w:t>
-      </w:r>
-    </w:p>
-    <w:p>
-      <w:pPr>
-        <w:spacing w:after="120"/>
-      </w:pPr>
-      <w:r>
-        <w:rPr>
-          <w:b/>
-          <w:i w:val="0"/>
         </w:rPr>
         <w:t>Wat heb ik aangepast?</w:t>
       </w:r>
     </w:p>
+    <w:tbl>
+      <w:tblPr>
+        <w:tblW w:type="auto" w:w="0"/>
+        <w:jc w:val="center"/>
+        <w:tblLayout w:type="fixed"/>
+        <w:tblLook w:firstColumn="1" w:firstRow="1" w:lastColumn="0" w:lastRow="0" w:noHBand="0" w:noVBand="1" w:val="04A0"/>
+        <w:tblBorders>
+          <w:top w:val="single" w:sz="6" w:space="0" w:color="A7B1DE"/>
+          <w:left w:val="single" w:sz="6" w:space="0" w:color="A7B1DE"/>
+          <w:bottom w:val="single" w:sz="6" w:space="0" w:color="A7B1DE"/>
+          <w:right w:val="single" w:sz="6" w:space="0" w:color="A7B1DE"/>
+          <w:insideH w:val="nil"/>
+          <w:insideV w:val="nil"/>
+        </w:tblBorders>
+        <w:tblLayout w:type="fixed"/>
+      </w:tblPr>
+      <w:tblGrid>
+        <w:gridCol w:w="9638"/>
+      </w:tblGrid>
+      <w:tr>
+        <w:trPr>
+          <w:trHeight w:val="680" w:hRule="atLeast"/>
+          <w:cantSplit/>
+        </w:trPr>
+        <w:tc>
+          <w:tcPr>
+            <w:tcW w:type="dxa" w:w="9638"/>
+            <w:shd w:val="clear" w:color="auto" w:fill="F3F5FC"/>
+          </w:tcPr>
+          <w:p>
+            <w:pPr>
+              <w:spacing w:before="0" w:after="0"/>
+            </w:pPr>
+          </w:p>
+        </w:tc>
+      </w:tr>
+    </w:tbl>
     <w:p>
       <w:pPr>
-        <w:spacing w:after="40"/>
+        <w:spacing w:before="0" w:after="0" w:line="80" w:lineRule="exact"/>
+        <w:rPr>
+          <w:sz w:val="4"/>
+        </w:rPr>
       </w:pPr>
-      <w:r>
-        <w:t>______________________________________________________________________</w:t>
-      </w:r>
     </w:p>
     <w:p>
       <w:pPr>
         <w:keepNext/>
-        <w:spacing w:before="280" w:after="80"/>
+        <w:pageBreakBefore w:val="0"/>
+        <w:spacing w:before="280" w:after="160"/>
+        <w:pBdr>
+          <w:bottom w:val="single" w:sz="6" w:space="3" w:color="A7B1DE"/>
+        </w:pBdr>
       </w:pPr>
       <w:r>
         <w:rPr>
+          <w:rFonts w:ascii="Montserrat" w:hAnsi="Montserrat" w:eastAsia="Montserrat"/>
           <w:b/>
+          <w:i w:val="0"/>
           <w:color w:val="2A3973"/>
-          <w:sz w:val="32"/>
+          <w:sz w:val="28"/>
         </w:rPr>
         <w:t>Deel 5 — Slotvraag</w:t>
       </w:r>
     </w:p>
     <w:p>
       <w:pPr>
-        <w:spacing w:after="120"/>
+        <w:keepNext/>
+        <w:spacing w:before="160" w:after="80"/>
       </w:pPr>
       <w:r>
         <w:rPr>
           <w:b/>
-          <w:i w:val="0"/>
         </w:rPr>
-        <w:t>Vraag 2. Welke twee dingen moet mevrouw De Clercq na het lezen van je e-mail zeker weten?</w:t>
+        <w:t>Welke twee dingen moet mevrouw De Clercq na het lezen van je e-mail zeker weten?</w:t>
       </w:r>
     </w:p>
+    <w:tbl>
+      <w:tblPr>
+        <w:tblW w:type="auto" w:w="0"/>
+        <w:jc w:val="center"/>
+        <w:tblLayout w:type="fixed"/>
+        <w:tblLook w:firstColumn="1" w:firstRow="1" w:lastColumn="0" w:lastRow="0" w:noHBand="0" w:noVBand="1" w:val="04A0"/>
+        <w:tblBorders>
+          <w:top w:val="single" w:sz="6" w:space="0" w:color="A7B1DE"/>
+          <w:left w:val="single" w:sz="6" w:space="0" w:color="A7B1DE"/>
+          <w:bottom w:val="single" w:sz="6" w:space="0" w:color="A7B1DE"/>
+          <w:right w:val="single" w:sz="6" w:space="0" w:color="A7B1DE"/>
+          <w:insideH w:val="nil"/>
+          <w:insideV w:val="nil"/>
+        </w:tblBorders>
+        <w:tblLayout w:type="fixed"/>
+      </w:tblPr>
+      <w:tblGrid>
+        <w:gridCol w:w="9638"/>
+      </w:tblGrid>
+      <w:tr>
+        <w:trPr>
+          <w:trHeight w:val="1020" w:hRule="atLeast"/>
+          <w:cantSplit/>
+        </w:trPr>
+        <w:tc>
+          <w:tcPr>
+            <w:tcW w:type="dxa" w:w="9638"/>
+            <w:shd w:val="clear" w:color="auto" w:fill="F3F5FC"/>
+          </w:tcPr>
+          <w:p>
+            <w:pPr>
+              <w:spacing w:before="0" w:after="0"/>
+            </w:pPr>
+          </w:p>
+        </w:tc>
+      </w:tr>
+    </w:tbl>
     <w:p>
       <w:pPr>
-        <w:spacing w:after="40"/>
+        <w:spacing w:before="0" w:after="0" w:line="80" w:lineRule="exact"/>
+        <w:rPr>
+          <w:sz w:val="4"/>
+        </w:rPr>
       </w:pPr>
-      <w:r>
-        <w:t>______________________________________________________________________</w:t>
-      </w:r>
-    </w:p>
-    <w:p>
-      <w:pPr>
-        <w:spacing w:after="40"/>
-      </w:pPr>
-      <w:r>
-        <w:t>______________________________________________________________________</w:t>
-      </w:r>
-    </w:p>
-    <w:p/>
-    <w:p>
-      <w:pPr>
-        <w:spacing w:after="120"/>
-      </w:pPr>
-      <w:r>
-        <w:rPr>
-          <w:b/>
-          <w:i w:val="0"/>
-        </w:rPr>
-        <w:t>Klaar? Klik in de opdracht op Inleveren.</w:t>
-      </w:r>
     </w:p>
     <w:sectPr>
-      <w:pgSz w:w="12240" w:h="15840"/>
-      <w:pgMar w:top="1134" w:right="1134" w:bottom="1134" w:left="1134" w:header="720" w:footer="720" w:gutter="0"/>
+      <w:pgSz w:w="11906" w:h="16838"/>
+      <w:pgMar w:top="1020" w:right="1134" w:bottom="1020" w:left="1134" w:header="720" w:footer="720" w:gutter="0"/>
       <w:cols w:space="720"/>
       <w:docGrid w:linePitch="360"/>
     </w:sectPr>
@@ -2111,9 +2977,13 @@
     <w:name w:val="Normal"/>
     <w:qFormat/>
     <w:rsid w:val="00FC693F"/>
+    <w:pPr>
+      <w:spacing w:after="80" w:line="264" w:lineRule="auto"/>
+    </w:pPr>
     <w:rPr>
-      <w:rFonts w:ascii="Arial" w:hAnsi="Arial" w:eastAsia="Arial"/>
-      <w:sz w:val="22"/>
+      <w:rFonts w:ascii="Calibri" w:hAnsi="Calibri" w:eastAsia="Calibri"/>
+      <w:color w:val="1F1F1F"/>
+      <w:sz w:val="24"/>
     </w:rPr>
   </w:style>
   <w:style w:type="paragraph" w:styleId="Header">

</xml_diff>

<commit_message>
Codewoord van de zelftest: in de groene regel van stap 7 en in deel 5
Het werkdocument heeft in deel 5 eerst een vak voor het codewoord; stap 7 zegt waar je het typt.

Co-Authored-By: Claude Opus 5.5 <noreply@anthropic.com>
</commit_message>
<xml_diff>
--- a/werkdocument/Interviewmail.docx
+++ b/werkdocument/Interviewmail.docx
@@ -2544,8 +2544,65 @@
           <w:color w:val="2A3973"/>
           <w:sz w:val="28"/>
         </w:rPr>
-        <w:t>Deel 5 — Slotvraag</w:t>
+        <w:t>Deel 5 — Codewoord en slotvraag</w:t>
       </w:r>
+    </w:p>
+    <w:p>
+      <w:pPr>
+        <w:keepNext/>
+        <w:spacing w:before="160" w:after="80"/>
+      </w:pPr>
+      <w:r>
+        <w:rPr>
+          <w:b/>
+        </w:rPr>
+        <w:t>Het codewoord van de zelftest (stap 7 op de lespagina):</w:t>
+      </w:r>
+    </w:p>
+    <w:tbl>
+      <w:tblPr>
+        <w:tblW w:type="auto" w:w="0"/>
+        <w:jc w:val="center"/>
+        <w:tblLayout w:type="fixed"/>
+        <w:tblLook w:firstColumn="1" w:firstRow="1" w:lastColumn="0" w:lastRow="0" w:noHBand="0" w:noVBand="1" w:val="04A0"/>
+        <w:tblBorders>
+          <w:top w:val="single" w:sz="6" w:space="0" w:color="A7B1DE"/>
+          <w:left w:val="single" w:sz="6" w:space="0" w:color="A7B1DE"/>
+          <w:bottom w:val="single" w:sz="6" w:space="0" w:color="A7B1DE"/>
+          <w:right w:val="single" w:sz="6" w:space="0" w:color="A7B1DE"/>
+          <w:insideH w:val="nil"/>
+          <w:insideV w:val="nil"/>
+        </w:tblBorders>
+        <w:tblLayout w:type="fixed"/>
+      </w:tblPr>
+      <w:tblGrid>
+        <w:gridCol w:w="9638"/>
+      </w:tblGrid>
+      <w:tr>
+        <w:trPr>
+          <w:trHeight w:val="510" w:hRule="atLeast"/>
+          <w:cantSplit/>
+        </w:trPr>
+        <w:tc>
+          <w:tcPr>
+            <w:tcW w:type="dxa" w:w="9638"/>
+            <w:shd w:val="clear" w:color="auto" w:fill="F3F5FC"/>
+          </w:tcPr>
+          <w:p>
+            <w:pPr>
+              <w:spacing w:before="0" w:after="0"/>
+            </w:pPr>
+          </w:p>
+        </w:tc>
+      </w:tr>
+    </w:tbl>
+    <w:p>
+      <w:pPr>
+        <w:spacing w:before="0" w:after="0" w:line="80" w:lineRule="exact"/>
+        <w:rPr>
+          <w:sz w:val="4"/>
+        </w:rPr>
+      </w:pPr>
     </w:p>
     <w:p>
       <w:pPr>

</xml_diff>